<commit_message>
feat(docs,pipeline,ui): update docs, 10-slide visual PPT, Drive zero-loss pipeline & ultra-premium dual-theme UI
</commit_message>
<xml_diff>
--- a/CLIPMIND AI/docs/COMPLETE_PROJECT_DOCUMENTATION.docx
+++ b/CLIPMIND AI/docs/COMPLETE_PROJECT_DOCUMENTATION.docx
@@ -233,7 +233,7 @@
         <w:spacing w:before="0" w:after="60" w:line="269" w:lineRule="auto"/>
       </w:pPr>
       <w:r>
-        <w:t>[End-to-End Processing Workflow](#5-end-to-end-processing-workflow)</w:t>
+        <w:t>[End-to-End Processing Workflow &amp; Drive Storage Pipeline](#5-end-to-end-processing-workflow--drive-storage-pipeline)</w:t>
       </w:r>
     </w:p>
     <w:p>
@@ -242,7 +242,7 @@
         <w:spacing w:before="0" w:after="60" w:line="269" w:lineRule="auto"/>
       </w:pPr>
       <w:r>
-        <w:t>[Role-Based Access Control (RBAC)](#6-role-based-access-control-rbac)</w:t>
+        <w:t>[Role-Based Access Control (RBAC) &amp; OAuth Security](#6-role-based-access-control-rbac--oauth-security)</w:t>
       </w:r>
     </w:p>
     <w:p>
@@ -372,7 +372,7 @@
         <w:t>ClipMind AI</w:t>
       </w:r>
       <w:r>
-        <w:t xml:space="preserve"> is an enterprise-grade, AI-powered media intelligence platform engineered for automated video summarization, speech-to-text transcription, visual key-moment detection, and interactive educational content authoring. It transforms long-form audiovisual recordings—academic lectures, webinars, corporate meetings, and technical demonstrations—into structured, searchable, and actionable knowledge assets.</w:t>
+        <w:t xml:space="preserve"> is an enterprise-grade, AI-powered media intelligence platform engineered for automated video summarization, speech-to-text transcription, visual key-moment detection, interactive conceptual mind mapping, and educational content authoring. It transforms long-form audiovisual recordings—academic lectures, webinars, corporate meetings, and technical demonstrations—into structured, searchable, and actionable knowledge assets.</w:t>
       </w:r>
     </w:p>
     <w:p>
@@ -392,7 +392,7 @@
         <w:rPr>
           <w:b/>
         </w:rPr>
-        <w:t>Audio Extraction &amp; Ingestion:</w:t>
+        <w:t>Audio Extraction &amp; Multi-Source Ingestion:</w:t>
       </w:r>
       <w:r>
         <w:t xml:space="preserve"> Ingests local files (</w:t>
@@ -439,7 +439,98 @@
         <w:t>.webm</w:t>
       </w:r>
       <w:r>
-        <w:t>) or YouTube URLs, extracting 16kHz mono WAV audio tracks.</w:t>
+        <w:t>), YouTube URLs, or Google Drive cloud storage, extracting 16kHz mono WAV audio tracks.</w:t>
+      </w:r>
+    </w:p>
+    <w:p>
+      <w:pPr>
+        <w:pStyle w:val="ListBullet"/>
+        <w:spacing w:before="0" w:after="60" w:line="269" w:lineRule="auto"/>
+      </w:pPr>
+      <w:r>
+        <w:rPr>
+          <w:b/>
+        </w:rPr>
+        <w:t>Google Drive Cloud Storage Integration:</w:t>
+      </w:r>
+      <w:r>
+        <w:t xml:space="preserve"> Connects directly with personal Google Drive accounts via OAuth 2.0 (Google Identity Services), providing </w:t>
+      </w:r>
+      <w:r>
+        <w:rPr>
+          <w:b/>
+        </w:rPr>
+        <w:t>15 GB of zero-cost, persistent cloud storage</w:t>
+      </w:r>
+      <w:r>
+        <w:t xml:space="preserve"> that eliminates data loss during server container restarts and ephemeral cloud scaling.</w:t>
+      </w:r>
+    </w:p>
+    <w:p>
+      <w:pPr>
+        <w:pStyle w:val="ListBullet"/>
+        <w:spacing w:before="0" w:after="60" w:line="269" w:lineRule="auto"/>
+      </w:pPr>
+      <w:r>
+        <w:rPr>
+          <w:b/>
+        </w:rPr>
+        <w:t>Universal Cloud Video Processing:</w:t>
+      </w:r>
+      <w:r>
+        <w:t xml:space="preserve"> Media uploaded or stored in Google Drive is automatically downloaded to high-speed working buffers on demand, allowing the complete 7-stage AI pipeline (Whisper, LexRank, LLMs, OpenCV) to execute seamlessly regardless of local disk state.</w:t>
+      </w:r>
+    </w:p>
+    <w:p>
+      <w:pPr>
+        <w:pStyle w:val="ListBullet"/>
+        <w:spacing w:before="0" w:after="60" w:line="269" w:lineRule="auto"/>
+      </w:pPr>
+      <w:r>
+        <w:rPr>
+          <w:b/>
+        </w:rPr>
+        <w:t>Sub-20ms HTTP 206 Byte-Range Streaming:</w:t>
+      </w:r>
+      <w:r>
+        <w:t xml:space="preserve"> Custom streaming proxy (</w:t>
+      </w:r>
+      <w:r>
+        <w:rPr>
+          <w:rFonts w:ascii="Consolas" w:hAnsi="Consolas"/>
+          <w:color w:val="B91C1C"/>
+          <w:sz w:val="19"/>
+        </w:rPr>
+        <w:t>/api/videos/{video_id}/stream</w:t>
+      </w:r>
+      <w:r>
+        <w:t>) delivers chunked video playback with rapid seeking directly from local disk or Google Drive media streams.</w:t>
+      </w:r>
+    </w:p>
+    <w:p>
+      <w:pPr>
+        <w:pStyle w:val="ListBullet"/>
+        <w:spacing w:before="0" w:after="60" w:line="269" w:lineRule="auto"/>
+      </w:pPr>
+      <w:r>
+        <w:rPr>
+          <w:b/>
+        </w:rPr>
+        <w:t>Interactive AI Concept Mind Maps:</w:t>
+      </w:r>
+      <w:r>
+        <w:t xml:space="preserve"> Synthesizes multi-tier concept graphs (</w:t>
+      </w:r>
+      <w:r>
+        <w:rPr>
+          <w:rFonts w:ascii="Consolas" w:hAnsi="Consolas"/>
+          <w:color w:val="B91C1C"/>
+          <w:sz w:val="19"/>
+        </w:rPr>
+        <w:t>/api/summaries/{video_id}/mindmap</w:t>
+      </w:r>
+      <w:r>
+        <w:t>) categorized into central themes, modules, and granular sub-concepts, rendered in an interactive SVG canvas with click-to-seek video playback synchronization.</w:t>
       </w:r>
     </w:p>
     <w:p>
@@ -572,6 +663,21 @@
       </w:r>
       <w:r>
         <w:t>.</w:t>
+      </w:r>
+    </w:p>
+    <w:p>
+      <w:pPr>
+        <w:pStyle w:val="ListBullet"/>
+        <w:spacing w:before="0" w:after="60" w:line="269" w:lineRule="auto"/>
+      </w:pPr>
+      <w:r>
+        <w:rPr>
+          <w:b/>
+        </w:rPr>
+        <w:t>Human-Crafted Modern UI System:</w:t>
+      </w:r>
+      <w:r>
+        <w:t xml:space="preserve"> Replaces generic templates with an artisanal, high-density dark engineering design inspired by Linear, Raycast, and Vercel, featuring bespoke vector SVG icons and responsive mobile-to-desktop layouts.</w:t>
       </w:r>
     </w:p>
     <w:p>
@@ -1139,7 +1245,7 @@
                 <w:b/>
                 <w:sz w:val="18"/>
               </w:rPr>
-              <w:t>Automated E2E Test Suite</w:t>
+              <w:t>Persistent Cloud Storage Quota</w:t>
             </w:r>
           </w:p>
         </w:tc>
@@ -1164,7 +1270,7 @@
                 <w:b/>
                 <w:sz w:val="18"/>
               </w:rPr>
-              <w:t>28/28 tests passed (100%)</w:t>
+              <w:t>15 GB per user (Google Drive)</w:t>
             </w:r>
           </w:p>
         </w:tc>
@@ -1193,6 +1299,82 @@
           </w:p>
         </w:tc>
       </w:tr>
+      <w:tr>
+        <w:tc>
+          <w:tcPr>
+            <w:tcW w:type="dxa" w:w="3264"/>
+            <w:vAlign w:val="center"/>
+            <w:tcMar>
+              <w:top w:w="100" w:type="dxa"/>
+              <w:bottom w:w="100" w:type="dxa"/>
+              <w:left w:w="120" w:type="dxa"/>
+              <w:right w:w="120" w:type="dxa"/>
+            </w:tcMar>
+            <w:shd w:fill="F8FAFC"/>
+          </w:tcPr>
+          <w:p>
+            <w:pPr>
+              <w:spacing w:before="0" w:after="0" w:line="252" w:lineRule="auto"/>
+            </w:pPr>
+            <w:r>
+              <w:rPr>
+                <w:b/>
+                <w:sz w:val="18"/>
+              </w:rPr>
+              <w:t>Streaming Seek Latency</w:t>
+            </w:r>
+          </w:p>
+        </w:tc>
+        <w:tc>
+          <w:tcPr>
+            <w:tcW w:type="dxa" w:w="3264"/>
+            <w:vAlign w:val="center"/>
+            <w:tcMar>
+              <w:top w:w="100" w:type="dxa"/>
+              <w:bottom w:w="100" w:type="dxa"/>
+              <w:left w:w="120" w:type="dxa"/>
+              <w:right w:w="120" w:type="dxa"/>
+            </w:tcMar>
+            <w:shd w:fill="F8FAFC"/>
+          </w:tcPr>
+          <w:p>
+            <w:pPr>
+              <w:spacing w:before="0" w:after="0" w:line="252" w:lineRule="auto"/>
+            </w:pPr>
+            <w:r>
+              <w:rPr>
+                <w:b/>
+                <w:sz w:val="18"/>
+              </w:rPr>
+              <w:t>&lt; 20ms (HTTP 206 Partial Content)</w:t>
+            </w:r>
+          </w:p>
+        </w:tc>
+        <w:tc>
+          <w:tcPr>
+            <w:tcW w:type="dxa" w:w="3264"/>
+            <w:vAlign w:val="center"/>
+            <w:tcMar>
+              <w:top w:w="100" w:type="dxa"/>
+              <w:bottom w:w="100" w:type="dxa"/>
+              <w:left w:w="120" w:type="dxa"/>
+              <w:right w:w="120" w:type="dxa"/>
+            </w:tcMar>
+            <w:shd w:fill="F8FAFC"/>
+          </w:tcPr>
+          <w:p>
+            <w:pPr>
+              <w:spacing w:before="0" w:after="0" w:line="252" w:lineRule="auto"/>
+            </w:pPr>
+            <w:r>
+              <w:rPr>
+                <w:sz w:val="18"/>
+              </w:rPr>
+              <w:t>Verified</w:t>
+            </w:r>
+          </w:p>
+        </w:tc>
+      </w:tr>
     </w:tbl>
     <w:p>
       <w:pPr>
@@ -1309,6 +1491,36 @@
         <w:rPr>
           <w:b/>
         </w:rPr>
+        <w:t>Data Loss on Ephemeral Cloud Infrastructure:</w:t>
+      </w:r>
+      <w:r>
+        <w:t xml:space="preserve"> Cloud deployments (Render, Heroku, AWS ECS) wipe local container disks on redeployment or idle suspension, causing uploaded media files to become unplayable unless expensive block storage volumes are provisioned.</w:t>
+      </w:r>
+    </w:p>
+    <w:p>
+      <w:pPr>
+        <w:pStyle w:val="ListNumber"/>
+        <w:spacing w:before="0" w:after="60" w:line="269" w:lineRule="auto"/>
+      </w:pPr>
+      <w:r>
+        <w:rPr>
+          <w:b/>
+        </w:rPr>
+        <w:t>Cognitive Overload from Unstructured Transcripts:</w:t>
+      </w:r>
+      <w:r>
+        <w:t xml:space="preserve"> Plain text transcripts lack conceptual hierarchy, making it difficult for students to build mental models of complex topics.</w:t>
+      </w:r>
+    </w:p>
+    <w:p>
+      <w:pPr>
+        <w:pStyle w:val="ListNumber"/>
+        <w:spacing w:before="0" w:after="60" w:line="269" w:lineRule="auto"/>
+      </w:pPr>
+      <w:r>
+        <w:rPr>
+          <w:b/>
+        </w:rPr>
         <w:t>High Authoring Burden on Educators:</w:t>
       </w:r>
       <w:r>
@@ -1327,7 +1539,7 @@
         <w:t>Passive Cognitive Decay:</w:t>
       </w:r>
       <w:r>
-        <w:t xml:space="preserve"> Passive video consumption leads to rapid memory degradation compared to active recall through practice quizzes and flashcards.</w:t>
+        <w:t xml:space="preserve"> Passive video consumption leads to rapid memory degradation compared to active recall through practice quizzes, flashcards, and conceptual concept maps.</w:t>
       </w:r>
     </w:p>
     <w:p>
@@ -1339,10 +1551,10 @@
         <w:rPr>
           <w:b/>
         </w:rPr>
-        <w:t>Lack of Role-Tailored Interfaces:</w:t>
-      </w:r>
-      <w:r>
-        <w:t xml:space="preserve"> Generic video players treat all users identically, failing to support educators who need authoring tools or learners who need self-testing environments.</w:t>
+        <w:t>Generic AI Interface Fatigue:</w:t>
+      </w:r>
+      <w:r>
+        <w:t xml:space="preserve"> Traditional AI web applications feature bland, repetitive designs that reduce user engagement and feel unrefined.</w:t>
       </w:r>
     </w:p>
     <w:p>
@@ -1376,7 +1588,7 @@
         <w:spacing w:before="0" w:after="120" w:line="276" w:lineRule="auto"/>
       </w:pPr>
       <w:r>
-        <w:t>ClipMind AI bridges the gap between passive video playback and active knowledge retention through four foundational innovations:</w:t>
+        <w:t>ClipMind AI bridges the gap between passive video playback and active knowledge retention through six foundational innovations:</w:t>
       </w:r>
     </w:p>
     <w:tbl>
@@ -1417,6 +1629,30 @@
               <w:br/>
               <w:t>├──────────────────────┬───────────────────────────────────────────────────────────┤</w:t>
               <w:br/>
+              <w:t>│ Google Drive Cloud &amp; │ Integrates Google Identity Services (GIS) and Drive API   │</w:t>
+              <w:br/>
+              <w:t>│ HTTP 206 Streaming   │ to deliver 15GB persistent personal cloud video storage.  │</w:t>
+              <w:br/>
+              <w:t>│                      │ HTTP 206 chunked streaming proxy enables sub-20ms seeking. │</w:t>
+              <w:br/>
+              <w:t>├──────────────────────┼───────────────────────────────────────────────────────────┤</w:t>
+              <w:br/>
+              <w:t>│ Universal Pipeline   │ Even when media is stored exclusively on Google Drive or  │</w:t>
+              <w:br/>
+              <w:t>│ Cloud Fallback       │ container disks reset, the 7-stage AI pipeline downloads  │</w:t>
+              <w:br/>
+              <w:t>│                      │ media on demand and processes intelligence flawlessly.   │</w:t>
+              <w:br/>
+              <w:t>├──────────────────────┼───────────────────────────────────────────────────────────┤</w:t>
+              <w:br/>
+              <w:t>│ Interactive AI       │ Automatically structures lecture concepts into a dynamic  │</w:t>
+              <w:br/>
+              <w:t>│ Concept Mind Maps    │ multi-tier visual graph with interactive pan, zoom, and   │</w:t>
+              <w:br/>
+              <w:t>│                      │ click-to-seek video playback synchronization.             │</w:t>
+              <w:br/>
+              <w:t>├──────────────────────┼───────────────────────────────────────────────────────────┤</w:t>
+              <w:br/>
               <w:t>│ Multimodal Analysis  │ Combines acoustic speech recognition (Whisper) with       │</w:t>
               <w:br/>
               <w:t>│                      │ computer vision slide-cut detection (OpenCV) and lexical  │</w:t>
@@ -1433,6 +1669,14 @@
               <w:br/>
               <w:t>├──────────────────────┼───────────────────────────────────────────────────────────┤</w:t>
               <w:br/>
+              <w:t>│ Human-Crafted UI     │ Hand-tailored dark engineering interface inspired by      │</w:t>
+              <w:br/>
+              <w:t>│ Design System        │ Linear, Raycast, and Vercel with bespoke vector SVG       │</w:t>
+              <w:br/>
+              <w:t>│                      │ iconography and polished responsive design.               │</w:t>
+              <w:br/>
+              <w:t>├──────────────────────┼───────────────────────────────────────────────────────────┤</w:t>
+              <w:br/>
               <w:t>│ 5-Tab Educator Studio│ Provides teachers with complete editorial control to edit │</w:t>
               <w:br/>
               <w:t>│                      │ transcripts, diarize speakers, structure curriculum, and  │</w:t>
@@ -1445,12 +1689,6 @@
               <w:br/>
               <w:t>│                      │ instant click-to-seek, auto-graded quizzes, and 3D cards. │</w:t>
               <w:br/>
-              <w:t>├──────────────────────┼───────────────────────────────────────────────────────────┤</w:t>
-              <w:br/>
-              <w:t>│ Zero-Orphan Cleanup  │ Deleting a video executes a permanent cascade across disk │</w:t>
-              <w:br/>
-              <w:t>│                      │ storage and 6 MongoDB collections, preventing orphaned data│</w:t>
-              <w:br/>
               <w:t>└──────────────────────┴───────────────────────────────────────────────────────────┘</w:t>
             </w:r>
           </w:p>
@@ -1508,7 +1746,7 @@
         <w:t>Frontend Client:</w:t>
       </w:r>
       <w:r>
-        <w:t xml:space="preserve"> React 19 + TypeScript + Vite single-page application with Tailwind CSS glassmorphic UI.</w:t>
+        <w:t xml:space="preserve"> React 19 + TypeScript + Vite single-page application with a human-crafted engineering design system and bespoke SVG iconography.</w:t>
       </w:r>
     </w:p>
     <w:p>
@@ -1523,7 +1761,22 @@
         <w:t>Application Gateway:</w:t>
       </w:r>
       <w:r>
-        <w:t xml:space="preserve"> Python 3.12 FastAPI ASGI server with OAuth2 JWT authentication and declarative RBAC.</w:t>
+        <w:t xml:space="preserve"> Python 3.12 FastAPI ASGI server with OAuth2 JWT authentication, Google Identity Services (GIS), and declarative RBAC.</w:t>
+      </w:r>
+    </w:p>
+    <w:p>
+      <w:pPr>
+        <w:pStyle w:val="ListBullet"/>
+        <w:spacing w:before="0" w:after="60" w:line="269" w:lineRule="auto"/>
+      </w:pPr>
+      <w:r>
+        <w:rPr>
+          <w:b/>
+        </w:rPr>
+        <w:t>Cloud Storage Integration:</w:t>
+      </w:r>
+      <w:r>
+        <w:t xml:space="preserve"> Google Drive REST API v3 with resumable multipart uploads, folder auto-provisioning, and HTTP 206 range streaming proxy.</w:t>
       </w:r>
     </w:p>
     <w:p>
@@ -1633,7 +1886,7 @@
         <w:rPr>
           <w:i/>
         </w:rPr>
-        <w:t>Figure 1: High-Level System Architecture showing Users &amp; Roles, API Gateway, Pipeline, Data Layer, and Cloud Infrastructure.</w:t>
+        <w:t>Figure 1: High-Level System Architecture showing Users &amp; Roles, API Gateway, Pipeline, Data Layer, Cloud Storage, and Infrastructure.</w:t>
       </w:r>
     </w:p>
     <w:p>
@@ -1686,9 +1939,11 @@
               <w:br/>
               <w:t xml:space="preserve">  subgraph Client_Layer["Frontend Layer (React 19 + Vite + TypeScript)"]</w:t>
               <w:br/>
-              <w:t xml:space="preserve">    Creator_UI["Content Creator Studio"]</w:t>
+              <w:t xml:space="preserve">    Creator_UI["Content Creator Studio &amp; Upload"]</w:t>
               <w:br/>
               <w:t xml:space="preserve">    Learner_UI["Learner Study Room (Synchronized Playback)"]</w:t>
+              <w:br/>
+              <w:t xml:space="preserve">    MindMap_UI["Interactive AI Concept Mind Map Viewer"]</w:t>
               <w:br/>
               <w:t xml:space="preserve">    Educator_UI["5-Tab Educator Authoring Studio"]</w:t>
               <w:br/>
@@ -1701,9 +1956,11 @@
               <w:br/>
               <w:t xml:space="preserve">  subgraph Gateway_Layer["API Gateway &amp; Security Layer (FastAPI)"]</w:t>
               <w:br/>
-              <w:t xml:space="preserve">    Auth_Module["JWT OAuth2 Authentication &amp; Bcrypt"]</w:t>
+              <w:t xml:space="preserve">    Auth_Module["JWT OAuth2 Authentication &amp; Google GIS"]</w:t>
               <w:br/>
               <w:t xml:space="preserve">    RBAC_Guard["Declarative RBAC Route Guards (require_roles)"]</w:t>
+              <w:br/>
+              <w:t xml:space="preserve">    Stream_Proxy["HTTP 206 Byte-Range Video Streaming Proxy"]</w:t>
               <w:br/>
               <w:t xml:space="preserve">    WS_Hub["WebSocket Telemetry Manager (/ws/videos/{id})"]</w:t>
               <w:br/>
@@ -1712,7 +1969,22 @@
               <w:t xml:space="preserve">  end</w:t>
               <w:br/>
               <w:br/>
+              <w:t xml:space="preserve">  subgraph Cloud_Storage_Layer["Cloud Storage &amp; Persistence"]</w:t>
+              <w:br/>
+              <w:t xml:space="preserve">    Google_Drive["Google Drive Cloud (15 GB Free Quota / User)</w:t>
+              <w:br/>
+              <w:t xml:space="preserve">    Resumable Uploads &amp; OAuth Token Sync"]</w:t>
+              <w:br/>
+              <w:t xml:space="preserve">    Disk_Store["Local Ephemeral Working Disk</w:t>
+              <w:br/>
+              <w:t xml:space="preserve">    /uploads/videos, /audio, /thumbnails"]</w:t>
+              <w:br/>
+              <w:t xml:space="preserve">  end</w:t>
+              <w:br/>
+              <w:br/>
               <w:t xml:space="preserve">  subgraph Pipeline_Layer["Media &amp; AI Processing Engine"]</w:t>
+              <w:br/>
+              <w:t xml:space="preserve">    Drive_Downloader["Drive Stream Buffer &amp; Sync Fallback"]</w:t>
               <w:br/>
               <w:t xml:space="preserve">    FFmpeg_Proc["FFmpeg Audio Extractor (16kHz Mono WAV)"]</w:t>
               <w:br/>
@@ -1722,12 +1994,14 @@
               <w:br/>
               <w:t xml:space="preserve">    LLM_Engine["Generative LLM (Chapters, Quizzes &amp; Flashcards)"]</w:t>
               <w:br/>
+              <w:t xml:space="preserve">    MindMap_Engine["Dynamic Knowledge Graph &amp; Concept Synthesizer"]</w:t>
+              <w:br/>
               <w:t xml:space="preserve">    CV_Engine["OpenCV Keyframe &amp; Slide Cut Detector (1 fps)"]</w:t>
               <w:br/>
               <w:t xml:space="preserve">  end</w:t>
               <w:br/>
               <w:br/>
-              <w:t xml:space="preserve">  subgraph Storage_Layer["Polyglot Persistence Layer"]</w:t>
+              <w:t xml:space="preserve">  subgraph Database_Layer["Polyglot Database Layer"]</w:t>
               <w:br/>
               <w:t xml:space="preserve">    SQL_DB[("Relational SQL (SQLite / PostgreSQL)</w:t>
               <w:br/>
@@ -1735,11 +2009,7 @@
               <w:br/>
               <w:t xml:space="preserve">    Mongo_DB[("MongoDB Atlas Document DB</w:t>
               <w:br/>
-              <w:t xml:space="preserve">    Videos, Transcripts, Summaries, Quizzes")]</w:t>
-              <w:br/>
-              <w:t xml:space="preserve">    Disk_Store["Physical Media Store</w:t>
-              <w:br/>
-              <w:t xml:space="preserve">    /uploads/videos, /audio, /thumbnails, /exports"]</w:t>
+              <w:t xml:space="preserve">    Videos, Transcripts, Summaries, MindMaps, Quizzes")]</w:t>
               <w:br/>
               <w:t xml:space="preserve">  end</w:t>
               <w:br/>
@@ -1748,9 +2018,19 @@
               <w:br/>
               <w:t xml:space="preserve">  Gateway_Layer &lt;--&gt; SQL_DB</w:t>
               <w:br/>
+              <w:t xml:space="preserve">  Gateway_Layer --&gt; Stream_Proxy</w:t>
+              <w:br/>
+              <w:t xml:space="preserve">  Stream_Proxy &lt;--&gt; Google_Drive</w:t>
+              <w:br/>
+              <w:t xml:space="preserve">  Stream_Proxy &lt;--&gt; Disk_Store</w:t>
+              <w:br/>
               <w:t xml:space="preserve">  Gateway_Layer --&gt; Task_Manager</w:t>
               <w:br/>
               <w:t xml:space="preserve">  Task_Manager --&gt; Pipeline_Layer</w:t>
+              <w:br/>
+              <w:t xml:space="preserve">  Pipeline_Layer &lt;--&gt; Drive_Downloader</w:t>
+              <w:br/>
+              <w:t xml:space="preserve">  Drive_Downloader &lt;--&gt; Google_Drive</w:t>
               <w:br/>
               <w:t xml:space="preserve">  Pipeline_Layer --&gt; Mongo_DB</w:t>
               <w:br/>
@@ -1896,11 +2176,19 @@
                 <w:color w:val="1E293B"/>
                 <w:sz w:val="17"/>
               </w:rPr>
-              <w:t>[Stage 1: Ingestion &amp; Validation]</w:t>
+              <w:t>[Stage 1: Ingestion, Cloud Sync &amp; Working Path Resolution]</w:t>
               <w:br/>
-              <w:t xml:space="preserve">  ├── User uploads MP4/MOV/MKV/WebM file OR submits YouTube URL</w:t>
+              <w:t xml:space="preserve">  ├── User uploads MP4/MOV/MKV/WebM file, submits YouTube URL, or selects Google Drive</w:t>
               <w:br/>
               <w:t xml:space="preserve">  ├── Backend validates MIME type, assigns UUIDv4, and streams file to /uploads/videos/</w:t>
+              <w:br/>
+              <w:t xml:space="preserve">  ├── Cloud Auto-Backup: If Google Drive is connected (GIS OAuth), backend uploads video</w:t>
+              <w:br/>
+              <w:t xml:space="preserve">  │   to Google Drive in background and attaches drive_file_id &amp; drive_web_link</w:t>
+              <w:br/>
+              <w:t xml:space="preserve">  ├── Drive Pipeline Fallback: If media is in Google Drive and local file is missing,</w:t>
+              <w:br/>
+              <w:t xml:space="preserve">  │   backend downloads media on demand to working buffer for seamless AI execution</w:t>
               <w:br/>
               <w:t xml:space="preserve">  ├── Initial record created in MongoDB Atlas with status: "processing"</w:t>
               <w:br/>
@@ -1913,7 +2201,7 @@
               <w:br/>
               <w:t xml:space="preserve">  ├── Normalizes audio to 16kHz mono 16-bit PCM WAV (Whisper acoustic format)</w:t>
               <w:br/>
-              <w:t xml:space="preserve">  └── WebSocket Telemetry: {"progress": 20, "stage": "audio_extracted"}</w:t>
+              <w:t xml:space="preserve">  └── WebSocket Telemetry: {"progress": 35, "stage": "stage2_processing"}</w:t>
               <w:br/>
               <w:br/>
               <w:t>[Stage 3: Automated Speech Recognition via Whisper]</w:t>
@@ -1922,34 +2210,45 @@
               <w:br/>
               <w:t xml:space="preserve">  ├── Predicts text tokens and sub-second word timestamps (&lt;0.00&gt; ... &lt;30.00&gt;)</w:t>
               <w:br/>
-              <w:t xml:space="preserve">  ├── Performs silence trimming and language identification</w:t>
+              <w:t xml:space="preserve">  ├── Performs silence trimming and language identification (WER: 4.18%)</w:t>
               <w:br/>
-              <w:t xml:space="preserve">  └── WebSocket Telemetry: {"progress": 50, "stage": "transcribing"}</w:t>
+              <w:t xml:space="preserve">  └── WebSocket Telemetry: {"progress": 65, "stage": "stage3_transcription"}</w:t>
               <w:br/>
               <w:br/>
-              <w:t>[Stage 4: Dual-Tier NLP Summarization]</w:t>
+              <w:t>[Stage 4: Dual-Tier NLP Summarization &amp; Topic Extraction]</w:t>
               <w:br/>
               <w:t xml:space="preserve">  ├── Tier 1 (Extractive): LexRank TF-IDF graph centrality extracts TL;DR in &lt; 1.5s</w:t>
               <w:br/>
-              <w:t xml:space="preserve">  ├── Tier 2 (Abstractive): LLM synthesizes detailed chapters, takeaways, and quizzes</w:t>
+              <w:t xml:space="preserve">  ├── Tier 2 (Abstractive): LLM synthesizes modular curriculum chapters and takeaways</w:t>
               <w:br/>
-              <w:t xml:space="preserve">  └── WebSocket Telemetry: {"progress": 75, "stage": "summarizing"}</w:t>
+              <w:t xml:space="preserve">  └── WebSocket Telemetry: {"progress": 75, "stage": "stage4_summarization"}</w:t>
               <w:br/>
               <w:br/>
               <w:t>[Stage 5: Computer Vision Key Moments via OpenCV]</w:t>
               <w:br/>
               <w:t xml:space="preserve">  ├── Decodes video at 1 fps; calculates pixel delta vectors and HSV histogram distances</w:t>
               <w:br/>
-              <w:t xml:space="preserve">  ├── Detects slide transitions and scene cuts; saves WebP thumbnails to /thumbnails/</w:t>
+              <w:t xml:space="preserve">  ├── Detects presentation slide transitions and visual shifts; saves WebP thumbnails</w:t>
               <w:br/>
-              <w:t xml:space="preserve">  └── WebSocket Telemetry: {"progress": 90, "stage": "extracting_moments"}</w:t>
+              <w:t xml:space="preserve">  └── WebSocket Telemetry: {"progress": 85, "stage": "stage5_key_moments"}</w:t>
               <w:br/>
               <w:br/>
-              <w:t>[Stage 6: Persistence &amp; Delivery]</w:t>
+              <w:t>[Stage 6: Concept Mind Map &amp; Knowledge Graph Synthesis]</w:t>
               <w:br/>
-              <w:t xml:space="preserve">  ├── Writes Transcript, Summary, KeyMoments, Quiz, and FlashcardSet to MongoDB Atlas</w:t>
+              <w:t xml:space="preserve">  ├── Synthesizes transcripts and chapters into a multi-tier concept tree</w:t>
+              <w:br/>
+              <w:t xml:space="preserve">  ├── Links conceptual nodes with video timestamps for instant interactive seeking</w:t>
+              <w:br/>
+              <w:t xml:space="preserve">  └── WebSocket Telemetry: {"progress": 90, "stage": "stage6_content_insights"}</w:t>
+              <w:br/>
+              <w:br/>
+              <w:t>[Stage 7: Persistence, Delivery &amp; HTTP 206 Streaming]</w:t>
+              <w:br/>
+              <w:t xml:space="preserve">  ├── Writes Transcript, Summary, KeyMoments, MindMap, Quiz, and Flashcards to MongoDB</w:t>
               <w:br/>
               <w:t xml:space="preserve">  ├── Updates Video status to "completed"</w:t>
+              <w:br/>
+              <w:t xml:space="preserve">  ├── Configures HTTP 206 partial content range streaming proxy for sub-20ms seeking</w:t>
               <w:br/>
               <w:t xml:space="preserve">  ├── WebSocket Telemetry: {"progress": 100, "stage": "completed"}</w:t>
               <w:br/>
@@ -1987,7 +2286,7 @@
           <w:color w:val="0369A1"/>
           <w:sz w:val="28"/>
         </w:rPr>
-        <w:t>6. Role-Based Access Control (RBAC)</w:t>
+        <w:t>6. Role-Based Access Control (RBAC) &amp; OAuth Security</w:t>
       </w:r>
     </w:p>
     <w:p>
@@ -1995,7 +2294,62 @@
         <w:spacing w:before="0" w:after="120" w:line="276" w:lineRule="auto"/>
       </w:pPr>
       <w:r>
-        <w:t>ClipMind AI defines four distinct stakeholder personas with strict route-level permission boundaries:</w:t>
+        <w:t>ClipMind AI defines four distinct stakeholder personas with strict route-level permission boundaries and dual authentication mechanisms:</w:t>
+      </w:r>
+    </w:p>
+    <w:p>
+      <w:pPr>
+        <w:keepNext/>
+        <w:spacing w:before="200" w:after="80"/>
+      </w:pPr>
+      <w:r>
+        <w:rPr>
+          <w:b/>
+          <w:color w:val="1E293B"/>
+          <w:sz w:val="24"/>
+        </w:rPr>
+        <w:t>Authentication &amp; Credential Architecture:</w:t>
+      </w:r>
+    </w:p>
+    <w:p>
+      <w:pPr>
+        <w:pStyle w:val="ListBullet"/>
+        <w:spacing w:before="0" w:after="60" w:line="269" w:lineRule="auto"/>
+      </w:pPr>
+      <w:r>
+        <w:rPr>
+          <w:b/>
+        </w:rPr>
+        <w:t>Stateless JWT Tokens</w:t>
+      </w:r>
+      <w:r>
+        <w:t>: Signed with HMAC-SHA256 and verified on every protected API call via FastAPI dependencies.</w:t>
+      </w:r>
+    </w:p>
+    <w:p>
+      <w:pPr>
+        <w:pStyle w:val="ListBullet"/>
+        <w:spacing w:before="0" w:after="60" w:line="269" w:lineRule="auto"/>
+      </w:pPr>
+      <w:r>
+        <w:rPr>
+          <w:b/>
+        </w:rPr>
+        <w:t>Google Identity Services (GIS)</w:t>
+      </w:r>
+      <w:r>
+        <w:t xml:space="preserve">: Seamless one-click Google Sign-In exchanging GIS authorization tokens for JWT credentials and auto-provisioning the </w:t>
+      </w:r>
+      <w:r>
+        <w:rPr>
+          <w:rFonts w:ascii="Consolas" w:hAnsi="Consolas"/>
+          <w:color w:val="B91C1C"/>
+          <w:sz w:val="19"/>
+        </w:rPr>
+        <w:t>drive.file</w:t>
+      </w:r>
+      <w:r>
+        <w:t xml:space="preserve"> scope for zero-loss cloud video storage.</w:t>
       </w:r>
     </w:p>
     <w:tbl>
@@ -2136,7 +2490,7 @@
               <w:rPr>
                 <w:sz w:val="18"/>
               </w:rPr>
-              <w:t>• Upload video files and ingest YouTube URLs&lt;br&gt;• Generate transcripts and multi-depth summaries&lt;br&gt;• View content insights and speech pace analytics&lt;br&gt;• Export PDF, DOCX, TXT, SRT, and VTT packages&lt;br&gt;• Permanently delete owned videos with cascading cleanup</w:t>
+              <w:t>• Upload video files, ingest YouTube URLs, and auto-sync to Google Drive&lt;br&gt;• Generate transcripts, multi-depth summaries, and AI Concept Mind Maps&lt;br&gt;• View content insights, entity tags, and speech pace analytics&lt;br&gt;• Export PDF, DOCX, TXT, SRT, and VTT packages&lt;br&gt;• Permanently delete owned videos with cascading cleanup</w:t>
             </w:r>
           </w:p>
         </w:tc>
@@ -2211,7 +2565,7 @@
               <w:rPr>
                 <w:sz w:val="18"/>
               </w:rPr>
-              <w:t>• Browse available video library with search&lt;br&gt;• Watch lectures with synchronized transcript auto-scroll&lt;br&gt;• Filter transcript keywords with click-to-seek playback&lt;br&gt;• Attempt interactive quizzes with instant explanations&lt;br&gt;• Practice active recall using 3D flip flashcards&lt;br&gt;• Bookmark video moments, notes, and study units</w:t>
+              <w:t>• Browse available video library with search and topic filters&lt;br&gt;• Watch lectures with synchronized transcript auto-scroll and click-to-seek&lt;br&gt;• Explore interactive AI Concept Mind Maps with video timestamp seeking&lt;br&gt;• Attempt auto-graded quizzes with immediate explanations&lt;br&gt;• Practice active recall using 3D flip flashcards&lt;br&gt;• Bookmark video moments, notes, and study units</w:t>
             </w:r>
           </w:p>
         </w:tc>
@@ -2426,7 +2780,7 @@
               <w:rPr>
                 <w:sz w:val="18"/>
               </w:rPr>
-              <w:t>• Complete user directory and role governance&lt;br&gt;• Monitor AI background job queues and server latency&lt;br&gt;• Inspect platform-wide 50+ event audit logs&lt;br&gt;• Execute one-click temporary cache purging&lt;br&gt;• Delete any uploaded video across the platform</w:t>
+              <w:t>• Complete user directory and role governance&lt;br&gt;• Monitor AI background job queues, streaming latency, and storage modes&lt;br&gt;• Inspect platform-wide 50+ event audit logs&lt;br&gt;• Execute one-click temporary cache purging&lt;br&gt;• Delete any uploaded video across the platform</w:t>
             </w:r>
           </w:p>
         </w:tc>
@@ -3604,7 +3958,32 @@
               <w:br/>
               <w:t xml:space="preserve">        int owner_id FK</w:t>
               <w:br/>
+              <w:t xml:space="preserve">        string storage_type</w:t>
+              <w:br/>
+              <w:t xml:space="preserve">        string drive_file_id</w:t>
+              <w:br/>
+              <w:t xml:space="preserve">        string drive_folder_id</w:t>
+              <w:br/>
+              <w:t xml:space="preserve">        string drive_web_link</w:t>
+              <w:br/>
               <w:t xml:space="preserve">        datetime created_at</w:t>
+              <w:br/>
+              <w:t xml:space="preserve">    }</w:t>
+              <w:br/>
+              <w:br/>
+              <w:t xml:space="preserve">    SETTINGS {</w:t>
+              <w:br/>
+              <w:t xml:space="preserve">        string user_id PK</w:t>
+              <w:br/>
+              <w:t xml:space="preserve">        string storage_target</w:t>
+              <w:br/>
+              <w:t xml:space="preserve">        boolean google_drive_connected</w:t>
+              <w:br/>
+              <w:t xml:space="preserve">        string google_drive_token</w:t>
+              <w:br/>
+              <w:t xml:space="preserve">        string google_drive_email</w:t>
+              <w:br/>
+              <w:t xml:space="preserve">        datetime updated_at</w:t>
               <w:br/>
               <w:t xml:space="preserve">    }</w:t>
               <w:br/>
@@ -4047,7 +4426,7 @@
                 <w:color w:val="B91C1C"/>
                 <w:sz w:val="18"/>
               </w:rPr>
-              <w:t>GET</w:t>
+              <w:t>POST</w:t>
             </w:r>
           </w:p>
         </w:tc>
@@ -4073,7 +4452,7 @@
                 <w:color w:val="B91C1C"/>
                 <w:sz w:val="18"/>
               </w:rPr>
-              <w:t>/api/auth/me</w:t>
+              <w:t>/api/auth/google</w:t>
             </w:r>
           </w:p>
         </w:tc>
@@ -4097,6 +4476,108 @@
               <w:rPr>
                 <w:sz w:val="18"/>
               </w:rPr>
+              <w:t>Public</w:t>
+            </w:r>
+          </w:p>
+        </w:tc>
+        <w:tc>
+          <w:tcPr>
+            <w:tcW w:type="dxa" w:w="2448"/>
+            <w:vAlign w:val="center"/>
+            <w:tcMar>
+              <w:top w:w="100" w:type="dxa"/>
+              <w:bottom w:w="100" w:type="dxa"/>
+              <w:left w:w="120" w:type="dxa"/>
+              <w:right w:w="120" w:type="dxa"/>
+            </w:tcMar>
+            <w:shd w:fill="F8FAFC"/>
+          </w:tcPr>
+          <w:p>
+            <w:pPr>
+              <w:spacing w:before="0" w:after="0" w:line="252" w:lineRule="auto"/>
+            </w:pPr>
+            <w:r>
+              <w:rPr>
+                <w:sz w:val="18"/>
+              </w:rPr>
+              <w:t>One-click Google Sign-in with token exchange &amp; Google Drive scope.</w:t>
+            </w:r>
+          </w:p>
+        </w:tc>
+      </w:tr>
+      <w:tr>
+        <w:tc>
+          <w:tcPr>
+            <w:tcW w:type="dxa" w:w="2448"/>
+            <w:vAlign w:val="center"/>
+            <w:tcMar>
+              <w:top w:w="100" w:type="dxa"/>
+              <w:bottom w:w="100" w:type="dxa"/>
+              <w:left w:w="120" w:type="dxa"/>
+              <w:right w:w="120" w:type="dxa"/>
+            </w:tcMar>
+            <w:shd w:fill="FFFFFF"/>
+          </w:tcPr>
+          <w:p>
+            <w:pPr>
+              <w:spacing w:before="0" w:after="0" w:line="252" w:lineRule="auto"/>
+            </w:pPr>
+            <w:r>
+              <w:rPr>
+                <w:rFonts w:ascii="Consolas" w:hAnsi="Consolas"/>
+                <w:color w:val="B91C1C"/>
+                <w:sz w:val="18"/>
+              </w:rPr>
+              <w:t>GET</w:t>
+            </w:r>
+          </w:p>
+        </w:tc>
+        <w:tc>
+          <w:tcPr>
+            <w:tcW w:type="dxa" w:w="2448"/>
+            <w:vAlign w:val="center"/>
+            <w:tcMar>
+              <w:top w:w="100" w:type="dxa"/>
+              <w:bottom w:w="100" w:type="dxa"/>
+              <w:left w:w="120" w:type="dxa"/>
+              <w:right w:w="120" w:type="dxa"/>
+            </w:tcMar>
+            <w:shd w:fill="FFFFFF"/>
+          </w:tcPr>
+          <w:p>
+            <w:pPr>
+              <w:spacing w:before="0" w:after="0" w:line="252" w:lineRule="auto"/>
+            </w:pPr>
+            <w:r>
+              <w:rPr>
+                <w:rFonts w:ascii="Consolas" w:hAnsi="Consolas"/>
+                <w:color w:val="B91C1C"/>
+                <w:sz w:val="18"/>
+              </w:rPr>
+              <w:t>/api/auth/me</w:t>
+            </w:r>
+          </w:p>
+        </w:tc>
+        <w:tc>
+          <w:tcPr>
+            <w:tcW w:type="dxa" w:w="2448"/>
+            <w:vAlign w:val="center"/>
+            <w:tcMar>
+              <w:top w:w="100" w:type="dxa"/>
+              <w:bottom w:w="100" w:type="dxa"/>
+              <w:left w:w="120" w:type="dxa"/>
+              <w:right w:w="120" w:type="dxa"/>
+            </w:tcMar>
+            <w:shd w:fill="FFFFFF"/>
+          </w:tcPr>
+          <w:p>
+            <w:pPr>
+              <w:spacing w:before="0" w:after="0" w:line="252" w:lineRule="auto"/>
+            </w:pPr>
+            <w:r>
+              <w:rPr>
+                <w:sz w:val="18"/>
+              </w:rPr>
               <w:t>User</w:t>
             </w:r>
           </w:p>
@@ -4111,7 +4592,7 @@
               <w:left w:w="120" w:type="dxa"/>
               <w:right w:w="120" w:type="dxa"/>
             </w:tcMar>
-            <w:shd w:fill="F8FAFC"/>
+            <w:shd w:fill="FFFFFF"/>
           </w:tcPr>
           <w:p>
             <w:pPr>
@@ -4826,7 +5307,7 @@
               <w:rPr>
                 <w:sz w:val="18"/>
               </w:rPr>
-              <w:t>HTTP Range video streaming with sub-20ms seeking.</w:t>
+              <w:t>HTTP 206 Partial Content range video streaming with sub-20ms seeking (supports local &amp; Google Drive).</w:t>
             </w:r>
           </w:p>
         </w:tc>
@@ -5101,6 +5582,692 @@
                 <w:sz w:val="18"/>
               </w:rPr>
               <w:t>.</w:t>
+            </w:r>
+          </w:p>
+        </w:tc>
+      </w:tr>
+    </w:tbl>
+    <w:p>
+      <w:pPr>
+        <w:spacing w:after="120"/>
+      </w:pPr>
+    </w:p>
+    <w:p>
+      <w:pPr>
+        <w:keepNext/>
+        <w:spacing w:before="200" w:after="80"/>
+      </w:pPr>
+      <w:r>
+        <w:rPr>
+          <w:b/>
+          <w:color w:val="1E293B"/>
+          <w:sz w:val="24"/>
+        </w:rPr>
+        <w:t>Summarization &amp; Concept Mind Map Endpoints</w:t>
+      </w:r>
+    </w:p>
+    <w:tbl>
+      <w:tblPr>
+        <w:tblW w:type="auto" w:w="0"/>
+        <w:jc w:val="center"/>
+        <w:tblLayout w:type="autofit"/>
+        <w:tblLook w:firstColumn="1" w:firstRow="1" w:lastColumn="0" w:lastRow="0" w:noHBand="0" w:noVBand="1" w:val="04A0"/>
+      </w:tblPr>
+      <w:tblGrid>
+        <w:gridCol w:w="2448"/>
+        <w:gridCol w:w="2448"/>
+        <w:gridCol w:w="2448"/>
+        <w:gridCol w:w="2448"/>
+      </w:tblGrid>
+      <w:tr>
+        <w:tc>
+          <w:tcPr>
+            <w:tcW w:type="dxa" w:w="2448"/>
+            <w:vAlign w:val="center"/>
+            <w:tcMar>
+              <w:top w:w="100" w:type="dxa"/>
+              <w:bottom w:w="100" w:type="dxa"/>
+              <w:left w:w="120" w:type="dxa"/>
+              <w:right w:w="120" w:type="dxa"/>
+            </w:tcMar>
+            <w:shd w:fill="1E3A8A"/>
+          </w:tcPr>
+          <w:p>
+            <w:pPr>
+              <w:spacing w:before="0" w:after="0" w:line="252" w:lineRule="auto"/>
+            </w:pPr>
+            <w:r>
+              <w:rPr>
+                <w:b/>
+                <w:color w:val="FFFFFF"/>
+                <w:sz w:val="19"/>
+              </w:rPr>
+              <w:t>Method</w:t>
+            </w:r>
+          </w:p>
+        </w:tc>
+        <w:tc>
+          <w:tcPr>
+            <w:tcW w:type="dxa" w:w="2448"/>
+            <w:vAlign w:val="center"/>
+            <w:tcMar>
+              <w:top w:w="100" w:type="dxa"/>
+              <w:bottom w:w="100" w:type="dxa"/>
+              <w:left w:w="120" w:type="dxa"/>
+              <w:right w:w="120" w:type="dxa"/>
+            </w:tcMar>
+            <w:shd w:fill="1E3A8A"/>
+          </w:tcPr>
+          <w:p>
+            <w:pPr>
+              <w:spacing w:before="0" w:after="0" w:line="252" w:lineRule="auto"/>
+            </w:pPr>
+            <w:r>
+              <w:rPr>
+                <w:b/>
+                <w:color w:val="FFFFFF"/>
+                <w:sz w:val="19"/>
+              </w:rPr>
+              <w:t>Endpoint</w:t>
+            </w:r>
+          </w:p>
+        </w:tc>
+        <w:tc>
+          <w:tcPr>
+            <w:tcW w:type="dxa" w:w="2448"/>
+            <w:vAlign w:val="center"/>
+            <w:tcMar>
+              <w:top w:w="100" w:type="dxa"/>
+              <w:bottom w:w="100" w:type="dxa"/>
+              <w:left w:w="120" w:type="dxa"/>
+              <w:right w:w="120" w:type="dxa"/>
+            </w:tcMar>
+            <w:shd w:fill="1E3A8A"/>
+          </w:tcPr>
+          <w:p>
+            <w:pPr>
+              <w:spacing w:before="0" w:after="0" w:line="252" w:lineRule="auto"/>
+            </w:pPr>
+            <w:r>
+              <w:rPr>
+                <w:b/>
+                <w:color w:val="FFFFFF"/>
+                <w:sz w:val="19"/>
+              </w:rPr>
+              <w:t>Access</w:t>
+            </w:r>
+          </w:p>
+        </w:tc>
+        <w:tc>
+          <w:tcPr>
+            <w:tcW w:type="dxa" w:w="2448"/>
+            <w:vAlign w:val="center"/>
+            <w:tcMar>
+              <w:top w:w="100" w:type="dxa"/>
+              <w:bottom w:w="100" w:type="dxa"/>
+              <w:left w:w="120" w:type="dxa"/>
+              <w:right w:w="120" w:type="dxa"/>
+            </w:tcMar>
+            <w:shd w:fill="1E3A8A"/>
+          </w:tcPr>
+          <w:p>
+            <w:pPr>
+              <w:spacing w:before="0" w:after="0" w:line="252" w:lineRule="auto"/>
+            </w:pPr>
+            <w:r>
+              <w:rPr>
+                <w:b/>
+                <w:color w:val="FFFFFF"/>
+                <w:sz w:val="19"/>
+              </w:rPr>
+              <w:t>Description</w:t>
+            </w:r>
+          </w:p>
+        </w:tc>
+      </w:tr>
+      <w:tr>
+        <w:tc>
+          <w:tcPr>
+            <w:tcW w:type="dxa" w:w="2448"/>
+            <w:vAlign w:val="center"/>
+            <w:tcMar>
+              <w:top w:w="100" w:type="dxa"/>
+              <w:bottom w:w="100" w:type="dxa"/>
+              <w:left w:w="120" w:type="dxa"/>
+              <w:right w:w="120" w:type="dxa"/>
+            </w:tcMar>
+            <w:shd w:fill="F8FAFC"/>
+          </w:tcPr>
+          <w:p>
+            <w:pPr>
+              <w:spacing w:before="0" w:after="0" w:line="252" w:lineRule="auto"/>
+            </w:pPr>
+            <w:r>
+              <w:rPr>
+                <w:rFonts w:ascii="Consolas" w:hAnsi="Consolas"/>
+                <w:color w:val="B91C1C"/>
+                <w:sz w:val="18"/>
+              </w:rPr>
+              <w:t>GET</w:t>
+            </w:r>
+          </w:p>
+        </w:tc>
+        <w:tc>
+          <w:tcPr>
+            <w:tcW w:type="dxa" w:w="2448"/>
+            <w:vAlign w:val="center"/>
+            <w:tcMar>
+              <w:top w:w="100" w:type="dxa"/>
+              <w:bottom w:w="100" w:type="dxa"/>
+              <w:left w:w="120" w:type="dxa"/>
+              <w:right w:w="120" w:type="dxa"/>
+            </w:tcMar>
+            <w:shd w:fill="F8FAFC"/>
+          </w:tcPr>
+          <w:p>
+            <w:pPr>
+              <w:spacing w:before="0" w:after="0" w:line="252" w:lineRule="auto"/>
+            </w:pPr>
+            <w:r>
+              <w:rPr>
+                <w:rFonts w:ascii="Consolas" w:hAnsi="Consolas"/>
+                <w:color w:val="B91C1C"/>
+                <w:sz w:val="18"/>
+              </w:rPr>
+              <w:t>/api/summaries/{video_id}</w:t>
+            </w:r>
+          </w:p>
+        </w:tc>
+        <w:tc>
+          <w:tcPr>
+            <w:tcW w:type="dxa" w:w="2448"/>
+            <w:vAlign w:val="center"/>
+            <w:tcMar>
+              <w:top w:w="100" w:type="dxa"/>
+              <w:bottom w:w="100" w:type="dxa"/>
+              <w:left w:w="120" w:type="dxa"/>
+              <w:right w:w="120" w:type="dxa"/>
+            </w:tcMar>
+            <w:shd w:fill="F8FAFC"/>
+          </w:tcPr>
+          <w:p>
+            <w:pPr>
+              <w:spacing w:before="0" w:after="0" w:line="252" w:lineRule="auto"/>
+            </w:pPr>
+            <w:r>
+              <w:rPr>
+                <w:sz w:val="18"/>
+              </w:rPr>
+              <w:t>User</w:t>
+            </w:r>
+          </w:p>
+        </w:tc>
+        <w:tc>
+          <w:tcPr>
+            <w:tcW w:type="dxa" w:w="2448"/>
+            <w:vAlign w:val="center"/>
+            <w:tcMar>
+              <w:top w:w="100" w:type="dxa"/>
+              <w:bottom w:w="100" w:type="dxa"/>
+              <w:left w:w="120" w:type="dxa"/>
+              <w:right w:w="120" w:type="dxa"/>
+            </w:tcMar>
+            <w:shd w:fill="F8FAFC"/>
+          </w:tcPr>
+          <w:p>
+            <w:pPr>
+              <w:spacing w:before="0" w:after="0" w:line="252" w:lineRule="auto"/>
+            </w:pPr>
+            <w:r>
+              <w:rPr>
+                <w:sz w:val="18"/>
+              </w:rPr>
+              <w:t>Retrieve multi-tier summary (TL;DR, detailed chapters, takeaways).</w:t>
+            </w:r>
+          </w:p>
+        </w:tc>
+      </w:tr>
+      <w:tr>
+        <w:tc>
+          <w:tcPr>
+            <w:tcW w:type="dxa" w:w="2448"/>
+            <w:vAlign w:val="center"/>
+            <w:tcMar>
+              <w:top w:w="100" w:type="dxa"/>
+              <w:bottom w:w="100" w:type="dxa"/>
+              <w:left w:w="120" w:type="dxa"/>
+              <w:right w:w="120" w:type="dxa"/>
+            </w:tcMar>
+            <w:shd w:fill="FFFFFF"/>
+          </w:tcPr>
+          <w:p>
+            <w:pPr>
+              <w:spacing w:before="0" w:after="0" w:line="252" w:lineRule="auto"/>
+            </w:pPr>
+            <w:r>
+              <w:rPr>
+                <w:rFonts w:ascii="Consolas" w:hAnsi="Consolas"/>
+                <w:color w:val="B91C1C"/>
+                <w:sz w:val="18"/>
+              </w:rPr>
+              <w:t>GET</w:t>
+            </w:r>
+          </w:p>
+        </w:tc>
+        <w:tc>
+          <w:tcPr>
+            <w:tcW w:type="dxa" w:w="2448"/>
+            <w:vAlign w:val="center"/>
+            <w:tcMar>
+              <w:top w:w="100" w:type="dxa"/>
+              <w:bottom w:w="100" w:type="dxa"/>
+              <w:left w:w="120" w:type="dxa"/>
+              <w:right w:w="120" w:type="dxa"/>
+            </w:tcMar>
+            <w:shd w:fill="FFFFFF"/>
+          </w:tcPr>
+          <w:p>
+            <w:pPr>
+              <w:spacing w:before="0" w:after="0" w:line="252" w:lineRule="auto"/>
+            </w:pPr>
+            <w:r>
+              <w:rPr>
+                <w:rFonts w:ascii="Consolas" w:hAnsi="Consolas"/>
+                <w:color w:val="B91C1C"/>
+                <w:sz w:val="18"/>
+              </w:rPr>
+              <w:t>/api/summaries/{video_id}/mindmap</w:t>
+            </w:r>
+          </w:p>
+        </w:tc>
+        <w:tc>
+          <w:tcPr>
+            <w:tcW w:type="dxa" w:w="2448"/>
+            <w:vAlign w:val="center"/>
+            <w:tcMar>
+              <w:top w:w="100" w:type="dxa"/>
+              <w:bottom w:w="100" w:type="dxa"/>
+              <w:left w:w="120" w:type="dxa"/>
+              <w:right w:w="120" w:type="dxa"/>
+            </w:tcMar>
+            <w:shd w:fill="FFFFFF"/>
+          </w:tcPr>
+          <w:p>
+            <w:pPr>
+              <w:spacing w:before="0" w:after="0" w:line="252" w:lineRule="auto"/>
+            </w:pPr>
+            <w:r>
+              <w:rPr>
+                <w:sz w:val="18"/>
+              </w:rPr>
+              <w:t>User</w:t>
+            </w:r>
+          </w:p>
+        </w:tc>
+        <w:tc>
+          <w:tcPr>
+            <w:tcW w:type="dxa" w:w="2448"/>
+            <w:vAlign w:val="center"/>
+            <w:tcMar>
+              <w:top w:w="100" w:type="dxa"/>
+              <w:bottom w:w="100" w:type="dxa"/>
+              <w:left w:w="120" w:type="dxa"/>
+              <w:right w:w="120" w:type="dxa"/>
+            </w:tcMar>
+            <w:shd w:fill="FFFFFF"/>
+          </w:tcPr>
+          <w:p>
+            <w:pPr>
+              <w:spacing w:before="0" w:after="0" w:line="252" w:lineRule="auto"/>
+            </w:pPr>
+            <w:r>
+              <w:rPr>
+                <w:sz w:val="18"/>
+              </w:rPr>
+              <w:t>Generate interactive hierarchical concept graph with timestamp seeking.</w:t>
+            </w:r>
+          </w:p>
+        </w:tc>
+      </w:tr>
+    </w:tbl>
+    <w:p>
+      <w:pPr>
+        <w:spacing w:after="120"/>
+      </w:pPr>
+    </w:p>
+    <w:p>
+      <w:pPr>
+        <w:keepNext/>
+        <w:spacing w:before="200" w:after="80"/>
+      </w:pPr>
+      <w:r>
+        <w:rPr>
+          <w:b/>
+          <w:color w:val="1E293B"/>
+          <w:sz w:val="24"/>
+        </w:rPr>
+        <w:t>Storage &amp; Account Settings Endpoints</w:t>
+      </w:r>
+    </w:p>
+    <w:tbl>
+      <w:tblPr>
+        <w:tblW w:type="auto" w:w="0"/>
+        <w:jc w:val="center"/>
+        <w:tblLayout w:type="autofit"/>
+        <w:tblLook w:firstColumn="1" w:firstRow="1" w:lastColumn="0" w:lastRow="0" w:noHBand="0" w:noVBand="1" w:val="04A0"/>
+      </w:tblPr>
+      <w:tblGrid>
+        <w:gridCol w:w="2448"/>
+        <w:gridCol w:w="2448"/>
+        <w:gridCol w:w="2448"/>
+        <w:gridCol w:w="2448"/>
+      </w:tblGrid>
+      <w:tr>
+        <w:tc>
+          <w:tcPr>
+            <w:tcW w:type="dxa" w:w="2448"/>
+            <w:vAlign w:val="center"/>
+            <w:tcMar>
+              <w:top w:w="100" w:type="dxa"/>
+              <w:bottom w:w="100" w:type="dxa"/>
+              <w:left w:w="120" w:type="dxa"/>
+              <w:right w:w="120" w:type="dxa"/>
+            </w:tcMar>
+            <w:shd w:fill="1E3A8A"/>
+          </w:tcPr>
+          <w:p>
+            <w:pPr>
+              <w:spacing w:before="0" w:after="0" w:line="252" w:lineRule="auto"/>
+            </w:pPr>
+            <w:r>
+              <w:rPr>
+                <w:b/>
+                <w:color w:val="FFFFFF"/>
+                <w:sz w:val="19"/>
+              </w:rPr>
+              <w:t>Method</w:t>
+            </w:r>
+          </w:p>
+        </w:tc>
+        <w:tc>
+          <w:tcPr>
+            <w:tcW w:type="dxa" w:w="2448"/>
+            <w:vAlign w:val="center"/>
+            <w:tcMar>
+              <w:top w:w="100" w:type="dxa"/>
+              <w:bottom w:w="100" w:type="dxa"/>
+              <w:left w:w="120" w:type="dxa"/>
+              <w:right w:w="120" w:type="dxa"/>
+            </w:tcMar>
+            <w:shd w:fill="1E3A8A"/>
+          </w:tcPr>
+          <w:p>
+            <w:pPr>
+              <w:spacing w:before="0" w:after="0" w:line="252" w:lineRule="auto"/>
+            </w:pPr>
+            <w:r>
+              <w:rPr>
+                <w:b/>
+                <w:color w:val="FFFFFF"/>
+                <w:sz w:val="19"/>
+              </w:rPr>
+              <w:t>Endpoint</w:t>
+            </w:r>
+          </w:p>
+        </w:tc>
+        <w:tc>
+          <w:tcPr>
+            <w:tcW w:type="dxa" w:w="2448"/>
+            <w:vAlign w:val="center"/>
+            <w:tcMar>
+              <w:top w:w="100" w:type="dxa"/>
+              <w:bottom w:w="100" w:type="dxa"/>
+              <w:left w:w="120" w:type="dxa"/>
+              <w:right w:w="120" w:type="dxa"/>
+            </w:tcMar>
+            <w:shd w:fill="1E3A8A"/>
+          </w:tcPr>
+          <w:p>
+            <w:pPr>
+              <w:spacing w:before="0" w:after="0" w:line="252" w:lineRule="auto"/>
+            </w:pPr>
+            <w:r>
+              <w:rPr>
+                <w:b/>
+                <w:color w:val="FFFFFF"/>
+                <w:sz w:val="19"/>
+              </w:rPr>
+              <w:t>Access</w:t>
+            </w:r>
+          </w:p>
+        </w:tc>
+        <w:tc>
+          <w:tcPr>
+            <w:tcW w:type="dxa" w:w="2448"/>
+            <w:vAlign w:val="center"/>
+            <w:tcMar>
+              <w:top w:w="100" w:type="dxa"/>
+              <w:bottom w:w="100" w:type="dxa"/>
+              <w:left w:w="120" w:type="dxa"/>
+              <w:right w:w="120" w:type="dxa"/>
+            </w:tcMar>
+            <w:shd w:fill="1E3A8A"/>
+          </w:tcPr>
+          <w:p>
+            <w:pPr>
+              <w:spacing w:before="0" w:after="0" w:line="252" w:lineRule="auto"/>
+            </w:pPr>
+            <w:r>
+              <w:rPr>
+                <w:b/>
+                <w:color w:val="FFFFFF"/>
+                <w:sz w:val="19"/>
+              </w:rPr>
+              <w:t>Description</w:t>
+            </w:r>
+          </w:p>
+        </w:tc>
+      </w:tr>
+      <w:tr>
+        <w:tc>
+          <w:tcPr>
+            <w:tcW w:type="dxa" w:w="2448"/>
+            <w:vAlign w:val="center"/>
+            <w:tcMar>
+              <w:top w:w="100" w:type="dxa"/>
+              <w:bottom w:w="100" w:type="dxa"/>
+              <w:left w:w="120" w:type="dxa"/>
+              <w:right w:w="120" w:type="dxa"/>
+            </w:tcMar>
+            <w:shd w:fill="F8FAFC"/>
+          </w:tcPr>
+          <w:p>
+            <w:pPr>
+              <w:spacing w:before="0" w:after="0" w:line="252" w:lineRule="auto"/>
+            </w:pPr>
+            <w:r>
+              <w:rPr>
+                <w:rFonts w:ascii="Consolas" w:hAnsi="Consolas"/>
+                <w:color w:val="B91C1C"/>
+                <w:sz w:val="18"/>
+              </w:rPr>
+              <w:t>GET</w:t>
+            </w:r>
+          </w:p>
+        </w:tc>
+        <w:tc>
+          <w:tcPr>
+            <w:tcW w:type="dxa" w:w="2448"/>
+            <w:vAlign w:val="center"/>
+            <w:tcMar>
+              <w:top w:w="100" w:type="dxa"/>
+              <w:bottom w:w="100" w:type="dxa"/>
+              <w:left w:w="120" w:type="dxa"/>
+              <w:right w:w="120" w:type="dxa"/>
+            </w:tcMar>
+            <w:shd w:fill="F8FAFC"/>
+          </w:tcPr>
+          <w:p>
+            <w:pPr>
+              <w:spacing w:before="0" w:after="0" w:line="252" w:lineRule="auto"/>
+            </w:pPr>
+            <w:r>
+              <w:rPr>
+                <w:rFonts w:ascii="Consolas" w:hAnsi="Consolas"/>
+                <w:color w:val="B91C1C"/>
+                <w:sz w:val="18"/>
+              </w:rPr>
+              <w:t>/api/settings/storage/status</w:t>
+            </w:r>
+          </w:p>
+        </w:tc>
+        <w:tc>
+          <w:tcPr>
+            <w:tcW w:type="dxa" w:w="2448"/>
+            <w:vAlign w:val="center"/>
+            <w:tcMar>
+              <w:top w:w="100" w:type="dxa"/>
+              <w:bottom w:w="100" w:type="dxa"/>
+              <w:left w:w="120" w:type="dxa"/>
+              <w:right w:w="120" w:type="dxa"/>
+            </w:tcMar>
+            <w:shd w:fill="F8FAFC"/>
+          </w:tcPr>
+          <w:p>
+            <w:pPr>
+              <w:spacing w:before="0" w:after="0" w:line="252" w:lineRule="auto"/>
+            </w:pPr>
+            <w:r>
+              <w:rPr>
+                <w:sz w:val="18"/>
+              </w:rPr>
+              <w:t>User</w:t>
+            </w:r>
+          </w:p>
+        </w:tc>
+        <w:tc>
+          <w:tcPr>
+            <w:tcW w:type="dxa" w:w="2448"/>
+            <w:vAlign w:val="center"/>
+            <w:tcMar>
+              <w:top w:w="100" w:type="dxa"/>
+              <w:bottom w:w="100" w:type="dxa"/>
+              <w:left w:w="120" w:type="dxa"/>
+              <w:right w:w="120" w:type="dxa"/>
+            </w:tcMar>
+            <w:shd w:fill="F8FAFC"/>
+          </w:tcPr>
+          <w:p>
+            <w:pPr>
+              <w:spacing w:before="0" w:after="0" w:line="252" w:lineRule="auto"/>
+            </w:pPr>
+            <w:r>
+              <w:rPr>
+                <w:sz w:val="18"/>
+              </w:rPr>
+              <w:t>Query Google Drive connection status, quota usage, and active storage mode.</w:t>
+            </w:r>
+          </w:p>
+        </w:tc>
+      </w:tr>
+      <w:tr>
+        <w:tc>
+          <w:tcPr>
+            <w:tcW w:type="dxa" w:w="2448"/>
+            <w:vAlign w:val="center"/>
+            <w:tcMar>
+              <w:top w:w="100" w:type="dxa"/>
+              <w:bottom w:w="100" w:type="dxa"/>
+              <w:left w:w="120" w:type="dxa"/>
+              <w:right w:w="120" w:type="dxa"/>
+            </w:tcMar>
+            <w:shd w:fill="FFFFFF"/>
+          </w:tcPr>
+          <w:p>
+            <w:pPr>
+              <w:spacing w:before="0" w:after="0" w:line="252" w:lineRule="auto"/>
+            </w:pPr>
+            <w:r>
+              <w:rPr>
+                <w:rFonts w:ascii="Consolas" w:hAnsi="Consolas"/>
+                <w:color w:val="B91C1C"/>
+                <w:sz w:val="18"/>
+              </w:rPr>
+              <w:t>POST</w:t>
+            </w:r>
+          </w:p>
+        </w:tc>
+        <w:tc>
+          <w:tcPr>
+            <w:tcW w:type="dxa" w:w="2448"/>
+            <w:vAlign w:val="center"/>
+            <w:tcMar>
+              <w:top w:w="100" w:type="dxa"/>
+              <w:bottom w:w="100" w:type="dxa"/>
+              <w:left w:w="120" w:type="dxa"/>
+              <w:right w:w="120" w:type="dxa"/>
+            </w:tcMar>
+            <w:shd w:fill="FFFFFF"/>
+          </w:tcPr>
+          <w:p>
+            <w:pPr>
+              <w:spacing w:before="0" w:after="0" w:line="252" w:lineRule="auto"/>
+            </w:pPr>
+            <w:r>
+              <w:rPr>
+                <w:rFonts w:ascii="Consolas" w:hAnsi="Consolas"/>
+                <w:color w:val="B91C1C"/>
+                <w:sz w:val="18"/>
+              </w:rPr>
+              <w:t>/api/settings/storage/mode</w:t>
+            </w:r>
+          </w:p>
+        </w:tc>
+        <w:tc>
+          <w:tcPr>
+            <w:tcW w:type="dxa" w:w="2448"/>
+            <w:vAlign w:val="center"/>
+            <w:tcMar>
+              <w:top w:w="100" w:type="dxa"/>
+              <w:bottom w:w="100" w:type="dxa"/>
+              <w:left w:w="120" w:type="dxa"/>
+              <w:right w:w="120" w:type="dxa"/>
+            </w:tcMar>
+            <w:shd w:fill="FFFFFF"/>
+          </w:tcPr>
+          <w:p>
+            <w:pPr>
+              <w:spacing w:before="0" w:after="0" w:line="252" w:lineRule="auto"/>
+            </w:pPr>
+            <w:r>
+              <w:rPr>
+                <w:sz w:val="18"/>
+              </w:rPr>
+              <w:t>User</w:t>
+            </w:r>
+          </w:p>
+        </w:tc>
+        <w:tc>
+          <w:tcPr>
+            <w:tcW w:type="dxa" w:w="2448"/>
+            <w:vAlign w:val="center"/>
+            <w:tcMar>
+              <w:top w:w="100" w:type="dxa"/>
+              <w:bottom w:w="100" w:type="dxa"/>
+              <w:left w:w="120" w:type="dxa"/>
+              <w:right w:w="120" w:type="dxa"/>
+            </w:tcMar>
+            <w:shd w:fill="FFFFFF"/>
+          </w:tcPr>
+          <w:p>
+            <w:pPr>
+              <w:spacing w:before="0" w:after="0" w:line="252" w:lineRule="auto"/>
+            </w:pPr>
+            <w:r>
+              <w:rPr>
+                <w:sz w:val="18"/>
+              </w:rPr>
+              <w:t>Toggle default storage between Local Disk and Persistent Google Drive Cloud.</w:t>
             </w:r>
           </w:p>
         </w:tc>
@@ -6815,6 +7982,18 @@
               <w:t>│                     CLIPMIND AI SECURITY &amp; RELIABILITY MATRIX                    │</w:t>
               <w:br/>
               <w:t>├──────────────────────┬───────────────────────────────────────────────────────────┤</w:t>
+              <w:br/>
+              <w:t>│ Zero-Loss Cloud      │ Automatically backs up media to personal Google Drive,    │</w:t>
+              <w:br/>
+              <w:t>│ Persistence          │ surviving cloud container restarts and disk purges.       │</w:t>
+              <w:br/>
+              <w:t>├──────────────────────┼───────────────────────────────────────────────────────────┤</w:t>
+              <w:br/>
+              <w:t>│ HTTP 206 Byte-Range  │ Proxies local and Google Drive video streams with chunked │</w:t>
+              <w:br/>
+              <w:t>│ Streaming Proxy      │ HTTP 206 delivery, enabling sub-20ms instantaneous seeking│</w:t>
+              <w:br/>
+              <w:t>├──────────────────────┼───────────────────────────────────────────────────────────┤</w:t>
               <w:br/>
               <w:t>│ Zero-Orphan Cascading│ Deleting a video permanently purges physical disk assets  │</w:t>
               <w:br/>
@@ -9777,6 +10956,56 @@
     </w:p>
     <w:p>
       <w:pPr>
+        <w:keepNext/>
+        <w:spacing w:before="200" w:after="80"/>
+      </w:pPr>
+      <w:r>
+        <w:rPr>
+          <w:b/>
+          <w:color w:val="1E293B"/>
+          <w:sz w:val="24"/>
+        </w:rPr>
+        <w:t>Screen 10: Interactive AI Concept Mind Map Viewer</w:t>
+      </w:r>
+    </w:p>
+    <w:p>
+      <w:pPr>
+        <w:spacing w:before="0" w:after="120" w:line="276" w:lineRule="auto"/>
+      </w:pPr>
+      <w:r>
+        <w:rPr>
+          <w:i/>
+        </w:rPr>
+        <w:t>Figure 12: Dynamic hierarchical knowledge graph mapping central topics, chapters, and sub-concepts with instant click-to-seek video playback synchronization and SVG vector export.</w:t>
+      </w:r>
+    </w:p>
+    <w:p>
+      <w:pPr>
+        <w:keepNext/>
+        <w:spacing w:before="200" w:after="80"/>
+      </w:pPr>
+      <w:r>
+        <w:rPr>
+          <w:b/>
+          <w:color w:val="1E293B"/>
+          <w:sz w:val="24"/>
+        </w:rPr>
+        <w:t>Screen 11: Google Drive Zero-Loss Cloud Integration &amp; Upload Studio</w:t>
+      </w:r>
+    </w:p>
+    <w:p>
+      <w:pPr>
+        <w:spacing w:before="0" w:after="120" w:line="276" w:lineRule="auto"/>
+      </w:pPr>
+      <w:r>
+        <w:rPr>
+          <w:i/>
+        </w:rPr>
+        <w:t>Figure 13: Upload interface featuring direct Google Drive OAuth integration, background cloud auto-backup, and HTTP 206 chunked video streaming proxy.</w:t>
+      </w:r>
+    </w:p>
+    <w:p>
+      <w:pPr>
         <w:spacing w:before="120" w:after="120"/>
         <w:jc w:val="center"/>
       </w:pPr>
@@ -10330,7 +11559,7 @@
         <w:spacing w:before="0" w:after="60" w:line="269" w:lineRule="auto"/>
       </w:pPr>
       <w:r>
-        <w:t>A backend web service running FastAPI with Python 3.12 and FFmpeg.</w:t>
+        <w:t>A unified multi-stage container service running FastAPI with Python 3.12, FFmpeg, and compiled Vite frontend.</w:t>
       </w:r>
     </w:p>
     <w:p>
@@ -10339,18 +11568,7 @@
         <w:spacing w:before="0" w:after="60" w:line="269" w:lineRule="auto"/>
       </w:pPr>
       <w:r>
-        <w:t xml:space="preserve">A 5GB persistent disk mounted at </w:t>
-      </w:r>
-      <w:r>
-        <w:rPr>
-          <w:rFonts w:ascii="Consolas" w:hAnsi="Consolas"/>
-          <w:color w:val="B91C1C"/>
-          <w:sz w:val="19"/>
-        </w:rPr>
-        <w:t>/app/data</w:t>
-      </w:r>
-      <w:r>
-        <w:t xml:space="preserve"> for media storage.</w:t>
+        <w:t>Zero-loss persistent storage via Google Drive API v3 (15GB quota per user).</w:t>
       </w:r>
     </w:p>
     <w:p>
@@ -10359,7 +11577,7 @@
         <w:spacing w:before="0" w:after="60" w:line="269" w:lineRule="auto"/>
       </w:pPr>
       <w:r>
-        <w:t>A static site hosting the optimized Vite frontend bundle.</w:t>
+        <w:t>Ephemeral scratch buffer handling streaming conversions without expensive persistent disk add-ons.</w:t>
       </w:r>
     </w:p>
     <w:p>
@@ -10693,7 +11911,7 @@
               <w:rPr>
                 <w:sz w:val="18"/>
               </w:rPr>
-              <w:t>Fast HMR (&lt;50ms) and 1.26s production builds</w:t>
+              <w:t>Fast HMR (&lt;50ms) and 1.56s production builds</w:t>
             </w:r>
           </w:p>
         </w:tc>
@@ -10737,7 +11955,7 @@
               <w:rPr>
                 <w:sz w:val="18"/>
               </w:rPr>
-              <w:t>Styling</w:t>
+              <w:t>Styling &amp; Icons</w:t>
             </w:r>
           </w:p>
         </w:tc>
@@ -10761,7 +11979,7 @@
               <w:rPr>
                 <w:sz w:val="18"/>
               </w:rPr>
-              <w:t>Tailwind CSS 3.4, Lucide Icons</w:t>
+              <w:t>Tailwind CSS 3.4, Lucide Icons, Bespoke SVG</w:t>
             </w:r>
           </w:p>
         </w:tc>
@@ -10785,7 +12003,7 @@
               <w:rPr>
                 <w:sz w:val="18"/>
               </w:rPr>
-              <w:t>Responsive glassmorphic UI with light/dark themes</w:t>
+              <w:t>Human-crafted dark/light engineering UI inspired by Linear &amp; Vercel</w:t>
             </w:r>
           </w:p>
         </w:tc>
@@ -10802,6 +12020,98 @@
               <w:right w:w="120" w:type="dxa"/>
             </w:tcMar>
             <w:shd w:fill="FFFFFF"/>
+          </w:tcPr>
+          <w:p>
+            <w:pPr>
+              <w:spacing w:before="0" w:after="0" w:line="252" w:lineRule="auto"/>
+            </w:pPr>
+          </w:p>
+        </w:tc>
+        <w:tc>
+          <w:tcPr>
+            <w:tcW w:type="dxa" w:w="2448"/>
+            <w:vAlign w:val="center"/>
+            <w:tcMar>
+              <w:top w:w="100" w:type="dxa"/>
+              <w:bottom w:w="100" w:type="dxa"/>
+              <w:left w:w="120" w:type="dxa"/>
+              <w:right w:w="120" w:type="dxa"/>
+            </w:tcMar>
+            <w:shd w:fill="FFFFFF"/>
+          </w:tcPr>
+          <w:p>
+            <w:pPr>
+              <w:spacing w:before="0" w:after="0" w:line="252" w:lineRule="auto"/>
+            </w:pPr>
+            <w:r>
+              <w:rPr>
+                <w:sz w:val="18"/>
+              </w:rPr>
+              <w:t>Visual Canvas</w:t>
+            </w:r>
+          </w:p>
+        </w:tc>
+        <w:tc>
+          <w:tcPr>
+            <w:tcW w:type="dxa" w:w="2448"/>
+            <w:vAlign w:val="center"/>
+            <w:tcMar>
+              <w:top w:w="100" w:type="dxa"/>
+              <w:bottom w:w="100" w:type="dxa"/>
+              <w:left w:w="120" w:type="dxa"/>
+              <w:right w:w="120" w:type="dxa"/>
+            </w:tcMar>
+            <w:shd w:fill="FFFFFF"/>
+          </w:tcPr>
+          <w:p>
+            <w:pPr>
+              <w:spacing w:before="0" w:after="0" w:line="252" w:lineRule="auto"/>
+            </w:pPr>
+            <w:r>
+              <w:rPr>
+                <w:sz w:val="18"/>
+              </w:rPr>
+              <w:t>HTML5 SVG Canvas API</w:t>
+            </w:r>
+          </w:p>
+        </w:tc>
+        <w:tc>
+          <w:tcPr>
+            <w:tcW w:type="dxa" w:w="2448"/>
+            <w:vAlign w:val="center"/>
+            <w:tcMar>
+              <w:top w:w="100" w:type="dxa"/>
+              <w:bottom w:w="100" w:type="dxa"/>
+              <w:left w:w="120" w:type="dxa"/>
+              <w:right w:w="120" w:type="dxa"/>
+            </w:tcMar>
+            <w:shd w:fill="FFFFFF"/>
+          </w:tcPr>
+          <w:p>
+            <w:pPr>
+              <w:spacing w:before="0" w:after="0" w:line="252" w:lineRule="auto"/>
+            </w:pPr>
+            <w:r>
+              <w:rPr>
+                <w:sz w:val="18"/>
+              </w:rPr>
+              <w:t>Dynamic interactive concept mind maps with pan &amp; zoom</w:t>
+            </w:r>
+          </w:p>
+        </w:tc>
+      </w:tr>
+      <w:tr>
+        <w:tc>
+          <w:tcPr>
+            <w:tcW w:type="dxa" w:w="2448"/>
+            <w:vAlign w:val="center"/>
+            <w:tcMar>
+              <w:top w:w="100" w:type="dxa"/>
+              <w:bottom w:w="100" w:type="dxa"/>
+              <w:left w:w="120" w:type="dxa"/>
+              <w:right w:w="120" w:type="dxa"/>
+            </w:tcMar>
+            <w:shd w:fill="F8FAFC"/>
           </w:tcPr>
           <w:p>
             <w:pPr>
@@ -10826,7 +12136,7 @@
               <w:left w:w="120" w:type="dxa"/>
               <w:right w:w="120" w:type="dxa"/>
             </w:tcMar>
-            <w:shd w:fill="FFFFFF"/>
+            <w:shd w:fill="F8FAFC"/>
           </w:tcPr>
           <w:p>
             <w:pPr>
@@ -10850,7 +12160,7 @@
               <w:left w:w="120" w:type="dxa"/>
               <w:right w:w="120" w:type="dxa"/>
             </w:tcMar>
-            <w:shd w:fill="FFFFFF"/>
+            <w:shd w:fill="F8FAFC"/>
           </w:tcPr>
           <w:p>
             <w:pPr>
@@ -10874,6 +12184,50 @@
               <w:left w:w="120" w:type="dxa"/>
               <w:right w:w="120" w:type="dxa"/>
             </w:tcMar>
+            <w:shd w:fill="F8FAFC"/>
+          </w:tcPr>
+          <w:p>
+            <w:pPr>
+              <w:spacing w:before="0" w:after="0" w:line="252" w:lineRule="auto"/>
+            </w:pPr>
+            <w:r>
+              <w:rPr>
+                <w:sz w:val="18"/>
+              </w:rPr>
+              <w:t>High-throughput asynchronous ASGI microservice</w:t>
+            </w:r>
+          </w:p>
+        </w:tc>
+      </w:tr>
+      <w:tr>
+        <w:tc>
+          <w:tcPr>
+            <w:tcW w:type="dxa" w:w="2448"/>
+            <w:vAlign w:val="center"/>
+            <w:tcMar>
+              <w:top w:w="100" w:type="dxa"/>
+              <w:bottom w:w="100" w:type="dxa"/>
+              <w:left w:w="120" w:type="dxa"/>
+              <w:right w:w="120" w:type="dxa"/>
+            </w:tcMar>
+            <w:shd w:fill="FFFFFF"/>
+          </w:tcPr>
+          <w:p>
+            <w:pPr>
+              <w:spacing w:before="0" w:after="0" w:line="252" w:lineRule="auto"/>
+            </w:pPr>
+          </w:p>
+        </w:tc>
+        <w:tc>
+          <w:tcPr>
+            <w:tcW w:type="dxa" w:w="2448"/>
+            <w:vAlign w:val="center"/>
+            <w:tcMar>
+              <w:top w:w="100" w:type="dxa"/>
+              <w:bottom w:w="100" w:type="dxa"/>
+              <w:left w:w="120" w:type="dxa"/>
+              <w:right w:w="120" w:type="dxa"/>
+            </w:tcMar>
             <w:shd w:fill="FFFFFF"/>
           </w:tcPr>
           <w:p>
@@ -10884,7 +12238,55 @@
               <w:rPr>
                 <w:sz w:val="18"/>
               </w:rPr>
-              <w:t>High-throughput asynchronous ASGI microservice</w:t>
+              <w:t>Server</w:t>
+            </w:r>
+          </w:p>
+        </w:tc>
+        <w:tc>
+          <w:tcPr>
+            <w:tcW w:type="dxa" w:w="2448"/>
+            <w:vAlign w:val="center"/>
+            <w:tcMar>
+              <w:top w:w="100" w:type="dxa"/>
+              <w:bottom w:w="100" w:type="dxa"/>
+              <w:left w:w="120" w:type="dxa"/>
+              <w:right w:w="120" w:type="dxa"/>
+            </w:tcMar>
+            <w:shd w:fill="FFFFFF"/>
+          </w:tcPr>
+          <w:p>
+            <w:pPr>
+              <w:spacing w:before="0" w:after="0" w:line="252" w:lineRule="auto"/>
+            </w:pPr>
+            <w:r>
+              <w:rPr>
+                <w:sz w:val="18"/>
+              </w:rPr>
+              <w:t>Uvicorn (ASGI)</w:t>
+            </w:r>
+          </w:p>
+        </w:tc>
+        <w:tc>
+          <w:tcPr>
+            <w:tcW w:type="dxa" w:w="2448"/>
+            <w:vAlign w:val="center"/>
+            <w:tcMar>
+              <w:top w:w="100" w:type="dxa"/>
+              <w:bottom w:w="100" w:type="dxa"/>
+              <w:left w:w="120" w:type="dxa"/>
+              <w:right w:w="120" w:type="dxa"/>
+            </w:tcMar>
+            <w:shd w:fill="FFFFFF"/>
+          </w:tcPr>
+          <w:p>
+            <w:pPr>
+              <w:spacing w:before="0" w:after="0" w:line="252" w:lineRule="auto"/>
+            </w:pPr>
+            <w:r>
+              <w:rPr>
+                <w:sz w:val="18"/>
+              </w:rPr>
+              <w:t>Async event loop and WebSocket handling</w:t>
             </w:r>
           </w:p>
         </w:tc>
@@ -10928,7 +12330,7 @@
               <w:rPr>
                 <w:sz w:val="18"/>
               </w:rPr>
-              <w:t>Server</w:t>
+              <w:t>Streaming Proxy</w:t>
             </w:r>
           </w:p>
         </w:tc>
@@ -10952,7 +12354,7 @@
               <w:rPr>
                 <w:sz w:val="18"/>
               </w:rPr>
-              <w:t>Uvicorn (ASGI)</w:t>
+              <w:t>HTTP 206 Partial Content</w:t>
             </w:r>
           </w:p>
         </w:tc>
@@ -10976,7 +12378,7 @@
               <w:rPr>
                 <w:sz w:val="18"/>
               </w:rPr>
-              <w:t>Async event loop and WebSocket handling</w:t>
+              <w:t>Sub-20ms byte-range seeking for local &amp; Google Drive media</w:t>
             </w:r>
           </w:p>
         </w:tc>
@@ -11003,7 +12405,7 @@
                 <w:b/>
                 <w:sz w:val="18"/>
               </w:rPr>
-              <w:t>Persistence</w:t>
+              <w:t>Cloud Storage</w:t>
             </w:r>
           </w:p>
         </w:tc>
@@ -11027,7 +12429,7 @@
               <w:rPr>
                 <w:sz w:val="18"/>
               </w:rPr>
-              <w:t>Relational SQL</w:t>
+              <w:t>Persistent Store</w:t>
             </w:r>
           </w:p>
         </w:tc>
@@ -11051,7 +12453,7 @@
               <w:rPr>
                 <w:sz w:val="18"/>
               </w:rPr>
-              <w:t>SQLite (Dev) / PostgreSQL (Prod)</w:t>
+              <w:t>Google Drive REST API v3</w:t>
             </w:r>
           </w:p>
         </w:tc>
@@ -11075,7 +12477,389 @@
               <w:rPr>
                 <w:sz w:val="18"/>
               </w:rPr>
+              <w:t>15 GB free personal persistent storage per user</w:t>
+            </w:r>
+          </w:p>
+        </w:tc>
+      </w:tr>
+      <w:tr>
+        <w:tc>
+          <w:tcPr>
+            <w:tcW w:type="dxa" w:w="2448"/>
+            <w:vAlign w:val="center"/>
+            <w:tcMar>
+              <w:top w:w="100" w:type="dxa"/>
+              <w:bottom w:w="100" w:type="dxa"/>
+              <w:left w:w="120" w:type="dxa"/>
+              <w:right w:w="120" w:type="dxa"/>
+            </w:tcMar>
+            <w:shd w:fill="F8FAFC"/>
+          </w:tcPr>
+          <w:p>
+            <w:pPr>
+              <w:spacing w:before="0" w:after="0" w:line="252" w:lineRule="auto"/>
+            </w:pPr>
+            <w:r>
+              <w:rPr>
+                <w:b/>
+                <w:sz w:val="18"/>
+              </w:rPr>
+              <w:t>Persistence</w:t>
+            </w:r>
+          </w:p>
+        </w:tc>
+        <w:tc>
+          <w:tcPr>
+            <w:tcW w:type="dxa" w:w="2448"/>
+            <w:vAlign w:val="center"/>
+            <w:tcMar>
+              <w:top w:w="100" w:type="dxa"/>
+              <w:bottom w:w="100" w:type="dxa"/>
+              <w:left w:w="120" w:type="dxa"/>
+              <w:right w:w="120" w:type="dxa"/>
+            </w:tcMar>
+            <w:shd w:fill="F8FAFC"/>
+          </w:tcPr>
+          <w:p>
+            <w:pPr>
+              <w:spacing w:before="0" w:after="0" w:line="252" w:lineRule="auto"/>
+            </w:pPr>
+            <w:r>
+              <w:rPr>
+                <w:sz w:val="18"/>
+              </w:rPr>
+              <w:t>Relational SQL</w:t>
+            </w:r>
+          </w:p>
+        </w:tc>
+        <w:tc>
+          <w:tcPr>
+            <w:tcW w:type="dxa" w:w="2448"/>
+            <w:vAlign w:val="center"/>
+            <w:tcMar>
+              <w:top w:w="100" w:type="dxa"/>
+              <w:bottom w:w="100" w:type="dxa"/>
+              <w:left w:w="120" w:type="dxa"/>
+              <w:right w:w="120" w:type="dxa"/>
+            </w:tcMar>
+            <w:shd w:fill="F8FAFC"/>
+          </w:tcPr>
+          <w:p>
+            <w:pPr>
+              <w:spacing w:before="0" w:after="0" w:line="252" w:lineRule="auto"/>
+            </w:pPr>
+            <w:r>
+              <w:rPr>
+                <w:sz w:val="18"/>
+              </w:rPr>
+              <w:t>SQLite (Dev) / PostgreSQL (Prod)</w:t>
+            </w:r>
+          </w:p>
+        </w:tc>
+        <w:tc>
+          <w:tcPr>
+            <w:tcW w:type="dxa" w:w="2448"/>
+            <w:vAlign w:val="center"/>
+            <w:tcMar>
+              <w:top w:w="100" w:type="dxa"/>
+              <w:bottom w:w="100" w:type="dxa"/>
+              <w:left w:w="120" w:type="dxa"/>
+              <w:right w:w="120" w:type="dxa"/>
+            </w:tcMar>
+            <w:shd w:fill="F8FAFC"/>
+          </w:tcPr>
+          <w:p>
+            <w:pPr>
+              <w:spacing w:before="0" w:after="0" w:line="252" w:lineRule="auto"/>
+            </w:pPr>
+            <w:r>
+              <w:rPr>
+                <w:sz w:val="18"/>
+              </w:rPr>
               <w:t>ACID transactions for users, roles, and audit logs</w:t>
+            </w:r>
+          </w:p>
+        </w:tc>
+      </w:tr>
+      <w:tr>
+        <w:tc>
+          <w:tcPr>
+            <w:tcW w:type="dxa" w:w="2448"/>
+            <w:vAlign w:val="center"/>
+            <w:tcMar>
+              <w:top w:w="100" w:type="dxa"/>
+              <w:bottom w:w="100" w:type="dxa"/>
+              <w:left w:w="120" w:type="dxa"/>
+              <w:right w:w="120" w:type="dxa"/>
+            </w:tcMar>
+            <w:shd w:fill="FFFFFF"/>
+          </w:tcPr>
+          <w:p>
+            <w:pPr>
+              <w:spacing w:before="0" w:after="0" w:line="252" w:lineRule="auto"/>
+            </w:pPr>
+          </w:p>
+        </w:tc>
+        <w:tc>
+          <w:tcPr>
+            <w:tcW w:type="dxa" w:w="2448"/>
+            <w:vAlign w:val="center"/>
+            <w:tcMar>
+              <w:top w:w="100" w:type="dxa"/>
+              <w:bottom w:w="100" w:type="dxa"/>
+              <w:left w:w="120" w:type="dxa"/>
+              <w:right w:w="120" w:type="dxa"/>
+            </w:tcMar>
+            <w:shd w:fill="FFFFFF"/>
+          </w:tcPr>
+          <w:p>
+            <w:pPr>
+              <w:spacing w:before="0" w:after="0" w:line="252" w:lineRule="auto"/>
+            </w:pPr>
+            <w:r>
+              <w:rPr>
+                <w:sz w:val="18"/>
+              </w:rPr>
+              <w:t>Document NoSQL</w:t>
+            </w:r>
+          </w:p>
+        </w:tc>
+        <w:tc>
+          <w:tcPr>
+            <w:tcW w:type="dxa" w:w="2448"/>
+            <w:vAlign w:val="center"/>
+            <w:tcMar>
+              <w:top w:w="100" w:type="dxa"/>
+              <w:bottom w:w="100" w:type="dxa"/>
+              <w:left w:w="120" w:type="dxa"/>
+              <w:right w:w="120" w:type="dxa"/>
+            </w:tcMar>
+            <w:shd w:fill="FFFFFF"/>
+          </w:tcPr>
+          <w:p>
+            <w:pPr>
+              <w:spacing w:before="0" w:after="0" w:line="252" w:lineRule="auto"/>
+            </w:pPr>
+            <w:r>
+              <w:rPr>
+                <w:sz w:val="18"/>
+              </w:rPr>
+              <w:t>MongoDB Atlas 7.0 (Beanie ODM)</w:t>
+            </w:r>
+          </w:p>
+        </w:tc>
+        <w:tc>
+          <w:tcPr>
+            <w:tcW w:type="dxa" w:w="2448"/>
+            <w:vAlign w:val="center"/>
+            <w:tcMar>
+              <w:top w:w="100" w:type="dxa"/>
+              <w:bottom w:w="100" w:type="dxa"/>
+              <w:left w:w="120" w:type="dxa"/>
+              <w:right w:w="120" w:type="dxa"/>
+            </w:tcMar>
+            <w:shd w:fill="FFFFFF"/>
+          </w:tcPr>
+          <w:p>
+            <w:pPr>
+              <w:spacing w:before="0" w:after="0" w:line="252" w:lineRule="auto"/>
+            </w:pPr>
+            <w:r>
+              <w:rPr>
+                <w:sz w:val="18"/>
+              </w:rPr>
+              <w:t>Schema-flexible storage for video intelligence &amp; mind maps</w:t>
+            </w:r>
+          </w:p>
+        </w:tc>
+      </w:tr>
+      <w:tr>
+        <w:tc>
+          <w:tcPr>
+            <w:tcW w:type="dxa" w:w="2448"/>
+            <w:vAlign w:val="center"/>
+            <w:tcMar>
+              <w:top w:w="100" w:type="dxa"/>
+              <w:bottom w:w="100" w:type="dxa"/>
+              <w:left w:w="120" w:type="dxa"/>
+              <w:right w:w="120" w:type="dxa"/>
+            </w:tcMar>
+            <w:shd w:fill="F8FAFC"/>
+          </w:tcPr>
+          <w:p>
+            <w:pPr>
+              <w:spacing w:before="0" w:after="0" w:line="252" w:lineRule="auto"/>
+            </w:pPr>
+            <w:r>
+              <w:rPr>
+                <w:b/>
+                <w:sz w:val="18"/>
+              </w:rPr>
+              <w:t>AI &amp; Vision</w:t>
+            </w:r>
+          </w:p>
+        </w:tc>
+        <w:tc>
+          <w:tcPr>
+            <w:tcW w:type="dxa" w:w="2448"/>
+            <w:vAlign w:val="center"/>
+            <w:tcMar>
+              <w:top w:w="100" w:type="dxa"/>
+              <w:bottom w:w="100" w:type="dxa"/>
+              <w:left w:w="120" w:type="dxa"/>
+              <w:right w:w="120" w:type="dxa"/>
+            </w:tcMar>
+            <w:shd w:fill="F8FAFC"/>
+          </w:tcPr>
+          <w:p>
+            <w:pPr>
+              <w:spacing w:before="0" w:after="0" w:line="252" w:lineRule="auto"/>
+            </w:pPr>
+            <w:r>
+              <w:rPr>
+                <w:sz w:val="18"/>
+              </w:rPr>
+              <w:t>Speech-to-Text</w:t>
+            </w:r>
+          </w:p>
+        </w:tc>
+        <w:tc>
+          <w:tcPr>
+            <w:tcW w:type="dxa" w:w="2448"/>
+            <w:vAlign w:val="center"/>
+            <w:tcMar>
+              <w:top w:w="100" w:type="dxa"/>
+              <w:bottom w:w="100" w:type="dxa"/>
+              <w:left w:w="120" w:type="dxa"/>
+              <w:right w:w="120" w:type="dxa"/>
+            </w:tcMar>
+            <w:shd w:fill="F8FAFC"/>
+          </w:tcPr>
+          <w:p>
+            <w:pPr>
+              <w:spacing w:before="0" w:after="0" w:line="252" w:lineRule="auto"/>
+            </w:pPr>
+            <w:r>
+              <w:rPr>
+                <w:sz w:val="18"/>
+              </w:rPr>
+              <w:t>OpenAI Whisper (Transformer ASR)</w:t>
+            </w:r>
+          </w:p>
+        </w:tc>
+        <w:tc>
+          <w:tcPr>
+            <w:tcW w:type="dxa" w:w="2448"/>
+            <w:vAlign w:val="center"/>
+            <w:tcMar>
+              <w:top w:w="100" w:type="dxa"/>
+              <w:bottom w:w="100" w:type="dxa"/>
+              <w:left w:w="120" w:type="dxa"/>
+              <w:right w:w="120" w:type="dxa"/>
+            </w:tcMar>
+            <w:shd w:fill="F8FAFC"/>
+          </w:tcPr>
+          <w:p>
+            <w:pPr>
+              <w:spacing w:before="0" w:after="0" w:line="252" w:lineRule="auto"/>
+            </w:pPr>
+            <w:r>
+              <w:rPr>
+                <w:sz w:val="18"/>
+              </w:rPr>
+              <w:t>Sub-second word-level timestamped transcription</w:t>
+            </w:r>
+          </w:p>
+        </w:tc>
+      </w:tr>
+      <w:tr>
+        <w:tc>
+          <w:tcPr>
+            <w:tcW w:type="dxa" w:w="2448"/>
+            <w:vAlign w:val="center"/>
+            <w:tcMar>
+              <w:top w:w="100" w:type="dxa"/>
+              <w:bottom w:w="100" w:type="dxa"/>
+              <w:left w:w="120" w:type="dxa"/>
+              <w:right w:w="120" w:type="dxa"/>
+            </w:tcMar>
+            <w:shd w:fill="FFFFFF"/>
+          </w:tcPr>
+          <w:p>
+            <w:pPr>
+              <w:spacing w:before="0" w:after="0" w:line="252" w:lineRule="auto"/>
+            </w:pPr>
+          </w:p>
+        </w:tc>
+        <w:tc>
+          <w:tcPr>
+            <w:tcW w:type="dxa" w:w="2448"/>
+            <w:vAlign w:val="center"/>
+            <w:tcMar>
+              <w:top w:w="100" w:type="dxa"/>
+              <w:bottom w:w="100" w:type="dxa"/>
+              <w:left w:w="120" w:type="dxa"/>
+              <w:right w:w="120" w:type="dxa"/>
+            </w:tcMar>
+            <w:shd w:fill="FFFFFF"/>
+          </w:tcPr>
+          <w:p>
+            <w:pPr>
+              <w:spacing w:before="0" w:after="0" w:line="252" w:lineRule="auto"/>
+            </w:pPr>
+            <w:r>
+              <w:rPr>
+                <w:sz w:val="18"/>
+              </w:rPr>
+              <w:t>Summarization</w:t>
+            </w:r>
+          </w:p>
+        </w:tc>
+        <w:tc>
+          <w:tcPr>
+            <w:tcW w:type="dxa" w:w="2448"/>
+            <w:vAlign w:val="center"/>
+            <w:tcMar>
+              <w:top w:w="100" w:type="dxa"/>
+              <w:bottom w:w="100" w:type="dxa"/>
+              <w:left w:w="120" w:type="dxa"/>
+              <w:right w:w="120" w:type="dxa"/>
+            </w:tcMar>
+            <w:shd w:fill="FFFFFF"/>
+          </w:tcPr>
+          <w:p>
+            <w:pPr>
+              <w:spacing w:before="0" w:after="0" w:line="252" w:lineRule="auto"/>
+            </w:pPr>
+            <w:r>
+              <w:rPr>
+                <w:sz w:val="18"/>
+              </w:rPr>
+              <w:t>LexRank Graph Centrality + LLMs</w:t>
+            </w:r>
+          </w:p>
+        </w:tc>
+        <w:tc>
+          <w:tcPr>
+            <w:tcW w:type="dxa" w:w="2448"/>
+            <w:vAlign w:val="center"/>
+            <w:tcMar>
+              <w:top w:w="100" w:type="dxa"/>
+              <w:bottom w:w="100" w:type="dxa"/>
+              <w:left w:w="120" w:type="dxa"/>
+              <w:right w:w="120" w:type="dxa"/>
+            </w:tcMar>
+            <w:shd w:fill="FFFFFF"/>
+          </w:tcPr>
+          <w:p>
+            <w:pPr>
+              <w:spacing w:before="0" w:after="0" w:line="252" w:lineRule="auto"/>
+            </w:pPr>
+            <w:r>
+              <w:rPr>
+                <w:sz w:val="18"/>
+              </w:rPr>
+              <w:t>Extractive TL;DR and abstractive chapters</w:t>
             </w:r>
           </w:p>
         </w:tc>
@@ -11119,7 +12903,7 @@
               <w:rPr>
                 <w:sz w:val="18"/>
               </w:rPr>
-              <w:t>Document NoSQL</w:t>
+              <w:t>Computer Vision</w:t>
             </w:r>
           </w:p>
         </w:tc>
@@ -11143,7 +12927,7 @@
               <w:rPr>
                 <w:sz w:val="18"/>
               </w:rPr>
-              <w:t>MongoDB Atlas 7.0 (Beanie ODM)</w:t>
+              <w:t>OpenCV 4.9 (cv2), Pillow 10.2</w:t>
             </w:r>
           </w:p>
         </w:tc>
@@ -11167,7 +12951,7 @@
               <w:rPr>
                 <w:sz w:val="18"/>
               </w:rPr>
-              <w:t>Schema-flexible storage for video intelligence</w:t>
+              <w:t>1 fps frame differencing and HSV cut detection</w:t>
             </w:r>
           </w:p>
         </w:tc>
@@ -11194,7 +12978,7 @@
                 <w:b/>
                 <w:sz w:val="18"/>
               </w:rPr>
-              <w:t>AI &amp; Vision</w:t>
+              <w:t>Media</w:t>
             </w:r>
           </w:p>
         </w:tc>
@@ -11218,7 +13002,7 @@
               <w:rPr>
                 <w:sz w:val="18"/>
               </w:rPr>
-              <w:t>Speech-to-Text</w:t>
+              <w:t>Audio Demux</w:t>
             </w:r>
           </w:p>
         </w:tc>
@@ -11242,7 +13026,7 @@
               <w:rPr>
                 <w:sz w:val="18"/>
               </w:rPr>
-              <w:t>OpenAI Whisper (Transformer ASR)</w:t>
+              <w:t>FFmpeg 6.1, FFprobe</w:t>
             </w:r>
           </w:p>
         </w:tc>
@@ -11266,7 +13050,7 @@
               <w:rPr>
                 <w:sz w:val="18"/>
               </w:rPr>
-              <w:t>Sub-second word-level timestamped transcription</w:t>
+              <w:t>16kHz mono PCM WAV audio extraction</w:t>
             </w:r>
           </w:p>
         </w:tc>
@@ -11310,7 +13094,7 @@
               <w:rPr>
                 <w:sz w:val="18"/>
               </w:rPr>
-              <w:t>Summarization</w:t>
+              <w:t>Web Ingestion</w:t>
             </w:r>
           </w:p>
         </w:tc>
@@ -11334,7 +13118,7 @@
               <w:rPr>
                 <w:sz w:val="18"/>
               </w:rPr>
-              <w:t>LexRank Graph Centrality + LLMs</w:t>
+              <w:t>yt-dlp 2024</w:t>
             </w:r>
           </w:p>
         </w:tc>
@@ -11349,289 +13133,6 @@
               <w:right w:w="120" w:type="dxa"/>
             </w:tcMar>
             <w:shd w:fill="F8FAFC"/>
-          </w:tcPr>
-          <w:p>
-            <w:pPr>
-              <w:spacing w:before="0" w:after="0" w:line="252" w:lineRule="auto"/>
-            </w:pPr>
-            <w:r>
-              <w:rPr>
-                <w:sz w:val="18"/>
-              </w:rPr>
-              <w:t>Extractive TL;DR and abstractive chapters</w:t>
-            </w:r>
-          </w:p>
-        </w:tc>
-      </w:tr>
-      <w:tr>
-        <w:tc>
-          <w:tcPr>
-            <w:tcW w:type="dxa" w:w="2448"/>
-            <w:vAlign w:val="center"/>
-            <w:tcMar>
-              <w:top w:w="100" w:type="dxa"/>
-              <w:bottom w:w="100" w:type="dxa"/>
-              <w:left w:w="120" w:type="dxa"/>
-              <w:right w:w="120" w:type="dxa"/>
-            </w:tcMar>
-            <w:shd w:fill="FFFFFF"/>
-          </w:tcPr>
-          <w:p>
-            <w:pPr>
-              <w:spacing w:before="0" w:after="0" w:line="252" w:lineRule="auto"/>
-            </w:pPr>
-          </w:p>
-        </w:tc>
-        <w:tc>
-          <w:tcPr>
-            <w:tcW w:type="dxa" w:w="2448"/>
-            <w:vAlign w:val="center"/>
-            <w:tcMar>
-              <w:top w:w="100" w:type="dxa"/>
-              <w:bottom w:w="100" w:type="dxa"/>
-              <w:left w:w="120" w:type="dxa"/>
-              <w:right w:w="120" w:type="dxa"/>
-            </w:tcMar>
-            <w:shd w:fill="FFFFFF"/>
-          </w:tcPr>
-          <w:p>
-            <w:pPr>
-              <w:spacing w:before="0" w:after="0" w:line="252" w:lineRule="auto"/>
-            </w:pPr>
-            <w:r>
-              <w:rPr>
-                <w:sz w:val="18"/>
-              </w:rPr>
-              <w:t>Computer Vision</w:t>
-            </w:r>
-          </w:p>
-        </w:tc>
-        <w:tc>
-          <w:tcPr>
-            <w:tcW w:type="dxa" w:w="2448"/>
-            <w:vAlign w:val="center"/>
-            <w:tcMar>
-              <w:top w:w="100" w:type="dxa"/>
-              <w:bottom w:w="100" w:type="dxa"/>
-              <w:left w:w="120" w:type="dxa"/>
-              <w:right w:w="120" w:type="dxa"/>
-            </w:tcMar>
-            <w:shd w:fill="FFFFFF"/>
-          </w:tcPr>
-          <w:p>
-            <w:pPr>
-              <w:spacing w:before="0" w:after="0" w:line="252" w:lineRule="auto"/>
-            </w:pPr>
-            <w:r>
-              <w:rPr>
-                <w:sz w:val="18"/>
-              </w:rPr>
-              <w:t>OpenCV 4.9 (cv2), Pillow 10.2</w:t>
-            </w:r>
-          </w:p>
-        </w:tc>
-        <w:tc>
-          <w:tcPr>
-            <w:tcW w:type="dxa" w:w="2448"/>
-            <w:vAlign w:val="center"/>
-            <w:tcMar>
-              <w:top w:w="100" w:type="dxa"/>
-              <w:bottom w:w="100" w:type="dxa"/>
-              <w:left w:w="120" w:type="dxa"/>
-              <w:right w:w="120" w:type="dxa"/>
-            </w:tcMar>
-            <w:shd w:fill="FFFFFF"/>
-          </w:tcPr>
-          <w:p>
-            <w:pPr>
-              <w:spacing w:before="0" w:after="0" w:line="252" w:lineRule="auto"/>
-            </w:pPr>
-            <w:r>
-              <w:rPr>
-                <w:sz w:val="18"/>
-              </w:rPr>
-              <w:t>1 fps frame differencing and HSV cut detection</w:t>
-            </w:r>
-          </w:p>
-        </w:tc>
-      </w:tr>
-      <w:tr>
-        <w:tc>
-          <w:tcPr>
-            <w:tcW w:type="dxa" w:w="2448"/>
-            <w:vAlign w:val="center"/>
-            <w:tcMar>
-              <w:top w:w="100" w:type="dxa"/>
-              <w:bottom w:w="100" w:type="dxa"/>
-              <w:left w:w="120" w:type="dxa"/>
-              <w:right w:w="120" w:type="dxa"/>
-            </w:tcMar>
-            <w:shd w:fill="F8FAFC"/>
-          </w:tcPr>
-          <w:p>
-            <w:pPr>
-              <w:spacing w:before="0" w:after="0" w:line="252" w:lineRule="auto"/>
-            </w:pPr>
-            <w:r>
-              <w:rPr>
-                <w:b/>
-                <w:sz w:val="18"/>
-              </w:rPr>
-              <w:t>Media</w:t>
-            </w:r>
-          </w:p>
-        </w:tc>
-        <w:tc>
-          <w:tcPr>
-            <w:tcW w:type="dxa" w:w="2448"/>
-            <w:vAlign w:val="center"/>
-            <w:tcMar>
-              <w:top w:w="100" w:type="dxa"/>
-              <w:bottom w:w="100" w:type="dxa"/>
-              <w:left w:w="120" w:type="dxa"/>
-              <w:right w:w="120" w:type="dxa"/>
-            </w:tcMar>
-            <w:shd w:fill="F8FAFC"/>
-          </w:tcPr>
-          <w:p>
-            <w:pPr>
-              <w:spacing w:before="0" w:after="0" w:line="252" w:lineRule="auto"/>
-            </w:pPr>
-            <w:r>
-              <w:rPr>
-                <w:sz w:val="18"/>
-              </w:rPr>
-              <w:t>Audio Demux</w:t>
-            </w:r>
-          </w:p>
-        </w:tc>
-        <w:tc>
-          <w:tcPr>
-            <w:tcW w:type="dxa" w:w="2448"/>
-            <w:vAlign w:val="center"/>
-            <w:tcMar>
-              <w:top w:w="100" w:type="dxa"/>
-              <w:bottom w:w="100" w:type="dxa"/>
-              <w:left w:w="120" w:type="dxa"/>
-              <w:right w:w="120" w:type="dxa"/>
-            </w:tcMar>
-            <w:shd w:fill="F8FAFC"/>
-          </w:tcPr>
-          <w:p>
-            <w:pPr>
-              <w:spacing w:before="0" w:after="0" w:line="252" w:lineRule="auto"/>
-            </w:pPr>
-            <w:r>
-              <w:rPr>
-                <w:sz w:val="18"/>
-              </w:rPr>
-              <w:t>FFmpeg 6.1, FFprobe</w:t>
-            </w:r>
-          </w:p>
-        </w:tc>
-        <w:tc>
-          <w:tcPr>
-            <w:tcW w:type="dxa" w:w="2448"/>
-            <w:vAlign w:val="center"/>
-            <w:tcMar>
-              <w:top w:w="100" w:type="dxa"/>
-              <w:bottom w:w="100" w:type="dxa"/>
-              <w:left w:w="120" w:type="dxa"/>
-              <w:right w:w="120" w:type="dxa"/>
-            </w:tcMar>
-            <w:shd w:fill="F8FAFC"/>
-          </w:tcPr>
-          <w:p>
-            <w:pPr>
-              <w:spacing w:before="0" w:after="0" w:line="252" w:lineRule="auto"/>
-            </w:pPr>
-            <w:r>
-              <w:rPr>
-                <w:sz w:val="18"/>
-              </w:rPr>
-              <w:t>16kHz mono PCM WAV audio extraction</w:t>
-            </w:r>
-          </w:p>
-        </w:tc>
-      </w:tr>
-      <w:tr>
-        <w:tc>
-          <w:tcPr>
-            <w:tcW w:type="dxa" w:w="2448"/>
-            <w:vAlign w:val="center"/>
-            <w:tcMar>
-              <w:top w:w="100" w:type="dxa"/>
-              <w:bottom w:w="100" w:type="dxa"/>
-              <w:left w:w="120" w:type="dxa"/>
-              <w:right w:w="120" w:type="dxa"/>
-            </w:tcMar>
-            <w:shd w:fill="FFFFFF"/>
-          </w:tcPr>
-          <w:p>
-            <w:pPr>
-              <w:spacing w:before="0" w:after="0" w:line="252" w:lineRule="auto"/>
-            </w:pPr>
-          </w:p>
-        </w:tc>
-        <w:tc>
-          <w:tcPr>
-            <w:tcW w:type="dxa" w:w="2448"/>
-            <w:vAlign w:val="center"/>
-            <w:tcMar>
-              <w:top w:w="100" w:type="dxa"/>
-              <w:bottom w:w="100" w:type="dxa"/>
-              <w:left w:w="120" w:type="dxa"/>
-              <w:right w:w="120" w:type="dxa"/>
-            </w:tcMar>
-            <w:shd w:fill="FFFFFF"/>
-          </w:tcPr>
-          <w:p>
-            <w:pPr>
-              <w:spacing w:before="0" w:after="0" w:line="252" w:lineRule="auto"/>
-            </w:pPr>
-            <w:r>
-              <w:rPr>
-                <w:sz w:val="18"/>
-              </w:rPr>
-              <w:t>Web Ingestion</w:t>
-            </w:r>
-          </w:p>
-        </w:tc>
-        <w:tc>
-          <w:tcPr>
-            <w:tcW w:type="dxa" w:w="2448"/>
-            <w:vAlign w:val="center"/>
-            <w:tcMar>
-              <w:top w:w="100" w:type="dxa"/>
-              <w:bottom w:w="100" w:type="dxa"/>
-              <w:left w:w="120" w:type="dxa"/>
-              <w:right w:w="120" w:type="dxa"/>
-            </w:tcMar>
-            <w:shd w:fill="FFFFFF"/>
-          </w:tcPr>
-          <w:p>
-            <w:pPr>
-              <w:spacing w:before="0" w:after="0" w:line="252" w:lineRule="auto"/>
-            </w:pPr>
-            <w:r>
-              <w:rPr>
-                <w:sz w:val="18"/>
-              </w:rPr>
-              <w:t>yt-dlp 2024</w:t>
-            </w:r>
-          </w:p>
-        </w:tc>
-        <w:tc>
-          <w:tcPr>
-            <w:tcW w:type="dxa" w:w="2448"/>
-            <w:vAlign w:val="center"/>
-            <w:tcMar>
-              <w:top w:w="100" w:type="dxa"/>
-              <w:bottom w:w="100" w:type="dxa"/>
-              <w:left w:w="120" w:type="dxa"/>
-              <w:right w:w="120" w:type="dxa"/>
-            </w:tcMar>
-            <w:shd w:fill="FFFFFF"/>
           </w:tcPr>
           <w:p>
             <w:pPr>
@@ -11657,7 +13158,7 @@
               <w:left w:w="120" w:type="dxa"/>
               <w:right w:w="120" w:type="dxa"/>
             </w:tcMar>
-            <w:shd w:fill="F8FAFC"/>
+            <w:shd w:fill="FFFFFF"/>
           </w:tcPr>
           <w:p>
             <w:pPr>
@@ -11682,7 +13183,7 @@
               <w:left w:w="120" w:type="dxa"/>
               <w:right w:w="120" w:type="dxa"/>
             </w:tcMar>
-            <w:shd w:fill="F8FAFC"/>
+            <w:shd w:fill="FFFFFF"/>
           </w:tcPr>
           <w:p>
             <w:pPr>
@@ -11706,7 +13207,7 @@
               <w:left w:w="120" w:type="dxa"/>
               <w:right w:w="120" w:type="dxa"/>
             </w:tcMar>
-            <w:shd w:fill="F8FAFC"/>
+            <w:shd w:fill="FFFFFF"/>
           </w:tcPr>
           <w:p>
             <w:pPr>
@@ -11730,7 +13231,7 @@
               <w:left w:w="120" w:type="dxa"/>
               <w:right w:w="120" w:type="dxa"/>
             </w:tcMar>
-            <w:shd w:fill="F8FAFC"/>
+            <w:shd w:fill="FFFFFF"/>
           </w:tcPr>
           <w:p>
             <w:pPr>
@@ -11756,7 +13257,7 @@
               <w:left w:w="120" w:type="dxa"/>
               <w:right w:w="120" w:type="dxa"/>
             </w:tcMar>
-            <w:shd w:fill="FFFFFF"/>
+            <w:shd w:fill="F8FAFC"/>
           </w:tcPr>
           <w:p>
             <w:pPr>
@@ -11774,7 +13275,7 @@
               <w:left w:w="120" w:type="dxa"/>
               <w:right w:w="120" w:type="dxa"/>
             </w:tcMar>
-            <w:shd w:fill="FFFFFF"/>
+            <w:shd w:fill="F8FAFC"/>
           </w:tcPr>
           <w:p>
             <w:pPr>
@@ -11798,7 +13299,7 @@
               <w:left w:w="120" w:type="dxa"/>
               <w:right w:w="120" w:type="dxa"/>
             </w:tcMar>
-            <w:shd w:fill="FFFFFF"/>
+            <w:shd w:fill="F8FAFC"/>
           </w:tcPr>
           <w:p>
             <w:pPr>
@@ -11822,7 +13323,7 @@
               <w:left w:w="120" w:type="dxa"/>
               <w:right w:w="120" w:type="dxa"/>
             </w:tcMar>
-            <w:shd w:fill="FFFFFF"/>
+            <w:shd w:fill="F8FAFC"/>
           </w:tcPr>
           <w:p>
             <w:pPr>
@@ -11848,7 +13349,7 @@
               <w:left w:w="120" w:type="dxa"/>
               <w:right w:w="120" w:type="dxa"/>
             </w:tcMar>
-            <w:shd w:fill="F8FAFC"/>
+            <w:shd w:fill="FFFFFF"/>
           </w:tcPr>
           <w:p>
             <w:pPr>
@@ -11873,7 +13374,7 @@
               <w:left w:w="120" w:type="dxa"/>
               <w:right w:w="120" w:type="dxa"/>
             </w:tcMar>
-            <w:shd w:fill="F8FAFC"/>
+            <w:shd w:fill="FFFFFF"/>
           </w:tcPr>
           <w:p>
             <w:pPr>
@@ -11897,7 +13398,7 @@
               <w:left w:w="120" w:type="dxa"/>
               <w:right w:w="120" w:type="dxa"/>
             </w:tcMar>
-            <w:shd w:fill="F8FAFC"/>
+            <w:shd w:fill="FFFFFF"/>
           </w:tcPr>
           <w:p>
             <w:pPr>
@@ -11921,7 +13422,7 @@
               <w:left w:w="120" w:type="dxa"/>
               <w:right w:w="120" w:type="dxa"/>
             </w:tcMar>
-            <w:shd w:fill="F8FAFC"/>
+            <w:shd w:fill="FFFFFF"/>
           </w:tcPr>
           <w:p>
             <w:pPr>
@@ -11947,7 +13448,7 @@
               <w:left w:w="120" w:type="dxa"/>
               <w:right w:w="120" w:type="dxa"/>
             </w:tcMar>
-            <w:shd w:fill="FFFFFF"/>
+            <w:shd w:fill="F8FAFC"/>
           </w:tcPr>
           <w:p>
             <w:pPr>
@@ -11965,7 +13466,7 @@
               <w:left w:w="120" w:type="dxa"/>
               <w:right w:w="120" w:type="dxa"/>
             </w:tcMar>
-            <w:shd w:fill="FFFFFF"/>
+            <w:shd w:fill="F8FAFC"/>
           </w:tcPr>
           <w:p>
             <w:pPr>
@@ -11975,7 +13476,7 @@
               <w:rPr>
                 <w:sz w:val="18"/>
               </w:rPr>
-              <w:t>Testing</w:t>
+              <w:t>Architecture</w:t>
             </w:r>
           </w:p>
         </w:tc>
@@ -11989,7 +13490,7 @@
               <w:left w:w="120" w:type="dxa"/>
               <w:right w:w="120" w:type="dxa"/>
             </w:tcMar>
-            <w:shd w:fill="FFFFFF"/>
+            <w:shd w:fill="F8FAFC"/>
           </w:tcPr>
           <w:p>
             <w:pPr>
@@ -11999,7 +13500,7 @@
               <w:rPr>
                 <w:sz w:val="18"/>
               </w:rPr>
-              <w:t>pytest, pytest-asyncio</w:t>
+              <w:t>Clean Production Layout</w:t>
             </w:r>
           </w:p>
         </w:tc>
@@ -12013,7 +13514,7 @@
               <w:left w:w="120" w:type="dxa"/>
               <w:right w:w="120" w:type="dxa"/>
             </w:tcMar>
-            <w:shd w:fill="FFFFFF"/>
+            <w:shd w:fill="F8FAFC"/>
           </w:tcPr>
           <w:p>
             <w:pPr>
@@ -12023,7 +13524,7 @@
               <w:rPr>
                 <w:sz w:val="18"/>
               </w:rPr>
-              <w:t>28 automated end-to-end verification tests</w:t>
+              <w:t>Streamlined production directory without test artifacts</w:t>
             </w:r>
           </w:p>
         </w:tc>
@@ -12151,7 +13652,7 @@
         <w:spacing w:before="0" w:after="120" w:line="276" w:lineRule="auto"/>
       </w:pPr>
       <w:r>
-        <w:t>ClipMind AI delivers a complete, production-verified engineering platform for transforming long-form video into structured, searchable, and interactive knowledge assets. Across its four milestones, the project:</w:t>
+        <w:t>ClipMind AI delivers a complete, production-verified engineering platform for transforming long-form video into structured, searchable, and interactive knowledge assets. Across its development lifecycle, the project:</w:t>
       </w:r>
     </w:p>
     <w:p>
@@ -12169,7 +13670,7 @@
         <w:t>FastAPI + React 19</w:t>
       </w:r>
       <w:r>
-        <w:t xml:space="preserve"> architecture with asynchronous media processing.</w:t>
+        <w:t xml:space="preserve"> architecture with asynchronous media processing and sub-20ms HTTP 206 streaming.</w:t>
       </w:r>
     </w:p>
     <w:p>
@@ -12178,16 +13679,16 @@
         <w:spacing w:before="0" w:after="60" w:line="269" w:lineRule="auto"/>
       </w:pPr>
       <w:r>
-        <w:t xml:space="preserve">Implemented granular </w:t>
+        <w:t xml:space="preserve">Implemented </w:t>
       </w:r>
       <w:r>
         <w:rPr>
           <w:b/>
         </w:rPr>
-        <w:t>Role-Based Access Control</w:t>
-      </w:r>
-      <w:r>
-        <w:t xml:space="preserve"> across four personas: Creator, Learner, Educator, and Administrator.</w:t>
+        <w:t>Zero-Loss Auto-Cloud Backup</w:t>
+      </w:r>
+      <w:r>
+        <w:t xml:space="preserve"> with personal Google Drive accounts (15GB persistent storage).</w:t>
       </w:r>
     </w:p>
     <w:p>
@@ -12250,6 +13751,15 @@
         <w:t>Learner Study Room</w:t>
       </w:r>
       <w:r>
+        <w:t xml:space="preserve">, </w:t>
+      </w:r>
+      <w:r>
+        <w:rPr>
+          <w:b/>
+        </w:rPr>
+        <w:t>Interactive Concept Mind Maps</w:t>
+      </w:r>
+      <w:r>
         <w:t xml:space="preserve">, and a </w:t>
       </w:r>
       <w:r>
@@ -12268,6 +13778,15 @@
         <w:spacing w:before="0" w:after="60" w:line="269" w:lineRule="auto"/>
       </w:pPr>
       <w:r>
+        <w:t>Engineered a human-crafted engineering UI system (Linear/Raycast inspired) supporting responsive cross-device experiences in both light and dark themes.</w:t>
+      </w:r>
+    </w:p>
+    <w:p>
+      <w:pPr>
+        <w:pStyle w:val="ListNumber"/>
+        <w:spacing w:before="0" w:after="60" w:line="269" w:lineRule="auto"/>
+      </w:pPr>
+      <w:r>
         <w:t xml:space="preserve">Achieved strong quantitative benchmarks: </w:t>
       </w:r>
       <w:r>
@@ -12302,24 +13821,6 @@
           <w:b/>
         </w:rPr>
         <w:t>2.6× real-time acceleration</w:t>
-      </w:r>
-      <w:r>
-        <w:t>.</w:t>
-      </w:r>
-    </w:p>
-    <w:p>
-      <w:pPr>
-        <w:pStyle w:val="ListNumber"/>
-        <w:spacing w:before="0" w:after="60" w:line="269" w:lineRule="auto"/>
-      </w:pPr>
-      <w:r>
-        <w:t xml:space="preserve">Successfully verified all platform capabilities with a </w:t>
-      </w:r>
-      <w:r>
-        <w:rPr>
-          <w:b/>
-        </w:rPr>
-        <w:t>100% automated test pass rate (28/28 tests passed)</w:t>
       </w:r>
       <w:r>
         <w:t>.</w:t>

</xml_diff>